<commit_message>
update: keep the outliers
</commit_message>
<xml_diff>
--- a/docs/report.docx
+++ b/docs/report.docx
@@ -33,25 +33,7 @@
           <w:sz w:val="22"/>
           <w:szCs w:val="22"/>
         </w:rPr>
-        <w:t xml:space="preserve">NTI Graduation Project </w:t>
-      </w:r>
-      <w:r>
-        <w:rPr>
-          <w:i/>
-          <w:iCs/>
-          <w:sz w:val="22"/>
-          <w:szCs w:val="22"/>
-        </w:rPr>
-        <w:t>-</w:t>
-      </w:r>
-      <w:r>
-        <w:rPr>
-          <w:i/>
-          <w:iCs/>
-          <w:sz w:val="22"/>
-          <w:szCs w:val="22"/>
-        </w:rPr>
-        <w:t xml:space="preserve"> Exploratory Data Analysis Report</w:t>
+        <w:t>NTI Graduation Project - Exploratory Data Analysis Report</w:t>
       </w:r>
     </w:p>
     <w:p>
@@ -113,15 +95,7 @@
         <w:spacing w:after="120"/>
       </w:pPr>
       <w:r>
-        <w:t xml:space="preserve">In this project, we </w:t>
-      </w:r>
-      <w:proofErr w:type="spellStart"/>
-      <w:r>
-        <w:t>analyze</w:t>
-      </w:r>
-      <w:proofErr w:type="spellEnd"/>
-      <w:r>
-        <w:t xml:space="preserve"> the IBM HR Analytics Employee Attrition dataset to find the main reasons employees leave the company and provide recommendations to help improve employee retention.</w:t>
+        <w:t>In this project, we analyze the IBM HR Analytics Employee Attrition dataset to find the main reasons employees leave the company and provide recommendations to help improve employee retention.</w:t>
       </w:r>
     </w:p>
     <w:p>
@@ -182,7 +156,6 @@
       <w:pPr>
         <w:spacing w:before="200" w:after="100"/>
         <w:rPr>
-          <w:rFonts w:hint="cs"/>
           <w:rtl/>
           <w:lang w:bidi="ar-EG"/>
         </w:rPr>
@@ -207,10 +180,7 @@
         </w:rPr>
       </w:pPr>
       <w:r>
-        <w:t>Source:</w:t>
-      </w:r>
-      <w:r>
-        <w:t xml:space="preserve"> </w:t>
+        <w:t xml:space="preserve">Source: </w:t>
       </w:r>
       <w:hyperlink r:id="rId7" w:history="1">
         <w:r>
@@ -218,21 +188,7 @@
             <w:rStyle w:val="Hyperlink"/>
             <w:color w:val="0A2F41" w:themeColor="accent1" w:themeShade="80"/>
           </w:rPr>
-          <w:t>https://www.kaggle.com/datasets/pavansubhasht/ibm-hr-analytics</w:t>
-        </w:r>
-        <w:r>
-          <w:rPr>
-            <w:rStyle w:val="Hyperlink"/>
-            <w:color w:val="0A2F41" w:themeColor="accent1" w:themeShade="80"/>
-          </w:rPr>
-          <w:t>-</w:t>
-        </w:r>
-        <w:r>
-          <w:rPr>
-            <w:rStyle w:val="Hyperlink"/>
-            <w:color w:val="0A2F41" w:themeColor="accent1" w:themeShade="80"/>
-          </w:rPr>
-          <w:t>attrition-dataset</w:t>
+          <w:t>https://www.kaggle.com/datasets/pavansubhasht/ibm-hr-analytics-attrition-dataset</w:t>
         </w:r>
       </w:hyperlink>
       <w:r>
@@ -301,12 +257,6 @@
         <w:gridCol w:w="7160"/>
       </w:tblGrid>
       <w:tr>
-        <w:tblPrEx>
-          <w:tblCellMar>
-            <w:top w:w="0" w:type="dxa"/>
-            <w:bottom w:w="0" w:type="dxa"/>
-          </w:tblCellMar>
-        </w:tblPrEx>
         <w:trPr>
           <w:tblHeader/>
         </w:trPr>
@@ -354,12 +304,6 @@
         </w:tc>
       </w:tr>
       <w:tr>
-        <w:tblPrEx>
-          <w:tblCellMar>
-            <w:top w:w="0" w:type="dxa"/>
-            <w:bottom w:w="0" w:type="dxa"/>
-          </w:tblCellMar>
-        </w:tblPrEx>
         <w:tc>
           <w:tcPr>
             <w:tcW w:w="2400" w:type="dxa"/>
@@ -402,12 +346,6 @@
         </w:tc>
       </w:tr>
       <w:tr>
-        <w:tblPrEx>
-          <w:tblCellMar>
-            <w:top w:w="0" w:type="dxa"/>
-            <w:bottom w:w="0" w:type="dxa"/>
-          </w:tblCellMar>
-        </w:tblPrEx>
         <w:tc>
           <w:tcPr>
             <w:tcW w:w="2400" w:type="dxa"/>
@@ -450,12 +388,6 @@
         </w:tc>
       </w:tr>
       <w:tr>
-        <w:tblPrEx>
-          <w:tblCellMar>
-            <w:top w:w="0" w:type="dxa"/>
-            <w:bottom w:w="0" w:type="dxa"/>
-          </w:tblCellMar>
-        </w:tblPrEx>
         <w:tc>
           <w:tcPr>
             <w:tcW w:w="2400" w:type="dxa"/>
@@ -472,14 +404,12 @@
                 <w:rFonts w:ascii="Consolas" w:hAnsi="Consolas"/>
               </w:rPr>
             </w:pPr>
-            <w:proofErr w:type="spellStart"/>
             <w:r>
               <w:rPr>
                 <w:rFonts w:ascii="Consolas" w:hAnsi="Consolas"/>
               </w:rPr>
               <w:t>BusinessTravel</w:t>
             </w:r>
-            <w:proofErr w:type="spellEnd"/>
           </w:p>
         </w:tc>
         <w:tc>
@@ -496,41 +426,655 @@
             <w:r>
               <w:t>Frequency of business travel (</w:t>
             </w:r>
-            <w:proofErr w:type="spellStart"/>
             <w:r>
               <w:rPr>
                 <w:rFonts w:ascii="Consolas" w:hAnsi="Consolas"/>
                 <w:sz w:val="18"/>
                 <w:szCs w:val="18"/>
               </w:rPr>
-              <w:t>Travel_Rarely</w:t>
-            </w:r>
-            <w:proofErr w:type="spellEnd"/>
+              <w:t>Travel_Rarely, Travel_Frequently, Non-Travel</w:t>
+            </w:r>
+            <w:r>
+              <w:t>).</w:t>
+            </w:r>
+          </w:p>
+        </w:tc>
+      </w:tr>
+      <w:tr>
+        <w:tc>
+          <w:tcPr>
+            <w:tcW w:w="2400" w:type="dxa"/>
+            <w:tcMar>
+              <w:top w:w="80" w:type="dxa"/>
+              <w:left w:w="100" w:type="dxa"/>
+              <w:bottom w:w="80" w:type="dxa"/>
+              <w:right w:w="100" w:type="dxa"/>
+            </w:tcMar>
+          </w:tcPr>
+          <w:p>
+            <w:pPr>
+              <w:rPr>
+                <w:rFonts w:ascii="Consolas" w:hAnsi="Consolas"/>
+              </w:rPr>
+            </w:pPr>
+            <w:r>
+              <w:rPr>
+                <w:rFonts w:ascii="Consolas" w:hAnsi="Consolas"/>
+              </w:rPr>
+              <w:t>DailyRate</w:t>
+            </w:r>
+          </w:p>
+        </w:tc>
+        <w:tc>
+          <w:tcPr>
+            <w:tcW w:w="7600" w:type="dxa"/>
+            <w:tcMar>
+              <w:top w:w="80" w:type="dxa"/>
+              <w:left w:w="100" w:type="dxa"/>
+              <w:bottom w:w="80" w:type="dxa"/>
+              <w:right w:w="100" w:type="dxa"/>
+            </w:tcMar>
+          </w:tcPr>
+          <w:p>
+            <w:r>
+              <w:t>Employee's daily salary rate.</w:t>
+            </w:r>
+          </w:p>
+        </w:tc>
+      </w:tr>
+      <w:tr>
+        <w:tc>
+          <w:tcPr>
+            <w:tcW w:w="2400" w:type="dxa"/>
+            <w:tcMar>
+              <w:top w:w="80" w:type="dxa"/>
+              <w:left w:w="100" w:type="dxa"/>
+              <w:bottom w:w="80" w:type="dxa"/>
+              <w:right w:w="100" w:type="dxa"/>
+            </w:tcMar>
+          </w:tcPr>
+          <w:p>
+            <w:pPr>
+              <w:rPr>
+                <w:rFonts w:ascii="Consolas" w:hAnsi="Consolas"/>
+              </w:rPr>
+            </w:pPr>
+            <w:r>
+              <w:rPr>
+                <w:rFonts w:ascii="Consolas" w:hAnsi="Consolas"/>
+              </w:rPr>
+              <w:t>Department</w:t>
+            </w:r>
+          </w:p>
+        </w:tc>
+        <w:tc>
+          <w:tcPr>
+            <w:tcW w:w="7600" w:type="dxa"/>
+            <w:tcMar>
+              <w:top w:w="80" w:type="dxa"/>
+              <w:left w:w="100" w:type="dxa"/>
+              <w:bottom w:w="80" w:type="dxa"/>
+              <w:right w:w="100" w:type="dxa"/>
+            </w:tcMar>
+          </w:tcPr>
+          <w:p>
+            <w:r>
+              <w:t>Department where the employee works.</w:t>
+            </w:r>
+          </w:p>
+        </w:tc>
+      </w:tr>
+      <w:tr>
+        <w:tc>
+          <w:tcPr>
+            <w:tcW w:w="2400" w:type="dxa"/>
+            <w:tcMar>
+              <w:top w:w="80" w:type="dxa"/>
+              <w:left w:w="100" w:type="dxa"/>
+              <w:bottom w:w="80" w:type="dxa"/>
+              <w:right w:w="100" w:type="dxa"/>
+            </w:tcMar>
+          </w:tcPr>
+          <w:p>
+            <w:pPr>
+              <w:rPr>
+                <w:rFonts w:ascii="Consolas" w:hAnsi="Consolas"/>
+              </w:rPr>
+            </w:pPr>
+            <w:r>
+              <w:rPr>
+                <w:rFonts w:ascii="Consolas" w:hAnsi="Consolas"/>
+              </w:rPr>
+              <w:t>DistanceFromHome</w:t>
+            </w:r>
+          </w:p>
+        </w:tc>
+        <w:tc>
+          <w:tcPr>
+            <w:tcW w:w="7600" w:type="dxa"/>
+            <w:tcMar>
+              <w:top w:w="80" w:type="dxa"/>
+              <w:left w:w="100" w:type="dxa"/>
+              <w:bottom w:w="80" w:type="dxa"/>
+              <w:right w:w="100" w:type="dxa"/>
+            </w:tcMar>
+          </w:tcPr>
+          <w:p>
+            <w:r>
+              <w:t>Distance between the employee's home and workplace (in miles).</w:t>
+            </w:r>
+          </w:p>
+        </w:tc>
+      </w:tr>
+      <w:tr>
+        <w:tc>
+          <w:tcPr>
+            <w:tcW w:w="2400" w:type="dxa"/>
+            <w:tcMar>
+              <w:top w:w="80" w:type="dxa"/>
+              <w:left w:w="100" w:type="dxa"/>
+              <w:bottom w:w="80" w:type="dxa"/>
+              <w:right w:w="100" w:type="dxa"/>
+            </w:tcMar>
+          </w:tcPr>
+          <w:p>
+            <w:pPr>
+              <w:rPr>
+                <w:rFonts w:ascii="Consolas" w:hAnsi="Consolas"/>
+              </w:rPr>
+            </w:pPr>
+            <w:r>
+              <w:rPr>
+                <w:rFonts w:ascii="Consolas" w:hAnsi="Consolas"/>
+              </w:rPr>
+              <w:t>Education</w:t>
+            </w:r>
+          </w:p>
+        </w:tc>
+        <w:tc>
+          <w:tcPr>
+            <w:tcW w:w="7600" w:type="dxa"/>
+            <w:tcMar>
+              <w:top w:w="80" w:type="dxa"/>
+              <w:left w:w="100" w:type="dxa"/>
+              <w:bottom w:w="80" w:type="dxa"/>
+              <w:right w:w="100" w:type="dxa"/>
+            </w:tcMar>
+          </w:tcPr>
+          <w:p>
+            <w:r>
+              <w:t>Employee's education level (1 = Below College, 5 = Doctor).</w:t>
+            </w:r>
+          </w:p>
+        </w:tc>
+      </w:tr>
+      <w:tr>
+        <w:tc>
+          <w:tcPr>
+            <w:tcW w:w="2400" w:type="dxa"/>
+            <w:tcMar>
+              <w:top w:w="80" w:type="dxa"/>
+              <w:left w:w="100" w:type="dxa"/>
+              <w:bottom w:w="80" w:type="dxa"/>
+              <w:right w:w="100" w:type="dxa"/>
+            </w:tcMar>
+          </w:tcPr>
+          <w:p>
+            <w:pPr>
+              <w:rPr>
+                <w:rFonts w:ascii="Consolas" w:hAnsi="Consolas"/>
+              </w:rPr>
+            </w:pPr>
+            <w:r>
+              <w:rPr>
+                <w:rFonts w:ascii="Consolas" w:hAnsi="Consolas"/>
+              </w:rPr>
+              <w:t>EducationField</w:t>
+            </w:r>
+          </w:p>
+        </w:tc>
+        <w:tc>
+          <w:tcPr>
+            <w:tcW w:w="7600" w:type="dxa"/>
+            <w:tcMar>
+              <w:top w:w="80" w:type="dxa"/>
+              <w:left w:w="100" w:type="dxa"/>
+              <w:bottom w:w="80" w:type="dxa"/>
+              <w:right w:w="100" w:type="dxa"/>
+            </w:tcMar>
+          </w:tcPr>
+          <w:p>
+            <w:r>
+              <w:t>Field of study or educational specialization.</w:t>
+            </w:r>
+          </w:p>
+        </w:tc>
+      </w:tr>
+      <w:tr>
+        <w:tc>
+          <w:tcPr>
+            <w:tcW w:w="2400" w:type="dxa"/>
+            <w:tcMar>
+              <w:top w:w="80" w:type="dxa"/>
+              <w:left w:w="100" w:type="dxa"/>
+              <w:bottom w:w="80" w:type="dxa"/>
+              <w:right w:w="100" w:type="dxa"/>
+            </w:tcMar>
+          </w:tcPr>
+          <w:p>
+            <w:pPr>
+              <w:rPr>
+                <w:rFonts w:ascii="Consolas" w:hAnsi="Consolas"/>
+              </w:rPr>
+            </w:pPr>
+            <w:r>
+              <w:rPr>
+                <w:rFonts w:ascii="Consolas" w:hAnsi="Consolas"/>
+              </w:rPr>
+              <w:t>EmployeeCount</w:t>
+            </w:r>
+          </w:p>
+        </w:tc>
+        <w:tc>
+          <w:tcPr>
+            <w:tcW w:w="7600" w:type="dxa"/>
+            <w:tcMar>
+              <w:top w:w="80" w:type="dxa"/>
+              <w:left w:w="100" w:type="dxa"/>
+              <w:bottom w:w="80" w:type="dxa"/>
+              <w:right w:w="100" w:type="dxa"/>
+            </w:tcMar>
+          </w:tcPr>
+          <w:p>
+            <w:r>
+              <w:t>Number of employees (constant value, usually 1).</w:t>
+            </w:r>
+          </w:p>
+        </w:tc>
+      </w:tr>
+      <w:tr>
+        <w:tc>
+          <w:tcPr>
+            <w:tcW w:w="2400" w:type="dxa"/>
+            <w:tcMar>
+              <w:top w:w="80" w:type="dxa"/>
+              <w:left w:w="100" w:type="dxa"/>
+              <w:bottom w:w="80" w:type="dxa"/>
+              <w:right w:w="100" w:type="dxa"/>
+            </w:tcMar>
+          </w:tcPr>
+          <w:p>
+            <w:pPr>
+              <w:rPr>
+                <w:rFonts w:ascii="Consolas" w:hAnsi="Consolas"/>
+              </w:rPr>
+            </w:pPr>
+            <w:r>
+              <w:rPr>
+                <w:rFonts w:ascii="Consolas" w:hAnsi="Consolas"/>
+              </w:rPr>
+              <w:t>EmployeeNumber</w:t>
+            </w:r>
+          </w:p>
+        </w:tc>
+        <w:tc>
+          <w:tcPr>
+            <w:tcW w:w="7600" w:type="dxa"/>
+            <w:tcMar>
+              <w:top w:w="80" w:type="dxa"/>
+              <w:left w:w="100" w:type="dxa"/>
+              <w:bottom w:w="80" w:type="dxa"/>
+              <w:right w:w="100" w:type="dxa"/>
+            </w:tcMar>
+          </w:tcPr>
+          <w:p>
+            <w:r>
+              <w:t>Unique identifier assigned to each employee.</w:t>
+            </w:r>
+          </w:p>
+        </w:tc>
+      </w:tr>
+      <w:tr>
+        <w:tc>
+          <w:tcPr>
+            <w:tcW w:w="2400" w:type="dxa"/>
+            <w:tcMar>
+              <w:top w:w="80" w:type="dxa"/>
+              <w:left w:w="100" w:type="dxa"/>
+              <w:bottom w:w="80" w:type="dxa"/>
+              <w:right w:w="100" w:type="dxa"/>
+            </w:tcMar>
+          </w:tcPr>
+          <w:p>
+            <w:pPr>
+              <w:rPr>
+                <w:rFonts w:ascii="Consolas" w:hAnsi="Consolas"/>
+              </w:rPr>
+            </w:pPr>
+            <w:r>
+              <w:rPr>
+                <w:rFonts w:ascii="Consolas" w:hAnsi="Consolas"/>
+              </w:rPr>
+              <w:t>EnvironmentSatisfaction</w:t>
+            </w:r>
+          </w:p>
+        </w:tc>
+        <w:tc>
+          <w:tcPr>
+            <w:tcW w:w="7600" w:type="dxa"/>
+            <w:tcMar>
+              <w:top w:w="80" w:type="dxa"/>
+              <w:left w:w="100" w:type="dxa"/>
+              <w:bottom w:w="80" w:type="dxa"/>
+              <w:right w:w="100" w:type="dxa"/>
+            </w:tcMar>
+          </w:tcPr>
+          <w:p>
+            <w:r>
+              <w:t>Employee's satisfaction with the work environment (1 = Low, 4 = Very High).</w:t>
+            </w:r>
+          </w:p>
+        </w:tc>
+      </w:tr>
+      <w:tr>
+        <w:tc>
+          <w:tcPr>
+            <w:tcW w:w="2400" w:type="dxa"/>
+            <w:tcMar>
+              <w:top w:w="80" w:type="dxa"/>
+              <w:left w:w="100" w:type="dxa"/>
+              <w:bottom w:w="80" w:type="dxa"/>
+              <w:right w:w="100" w:type="dxa"/>
+            </w:tcMar>
+          </w:tcPr>
+          <w:p>
+            <w:pPr>
+              <w:rPr>
+                <w:rFonts w:ascii="Consolas" w:hAnsi="Consolas"/>
+              </w:rPr>
+            </w:pPr>
+            <w:r>
+              <w:rPr>
+                <w:rFonts w:ascii="Consolas" w:hAnsi="Consolas"/>
+              </w:rPr>
+              <w:t>Gender</w:t>
+            </w:r>
+          </w:p>
+        </w:tc>
+        <w:tc>
+          <w:tcPr>
+            <w:tcW w:w="7600" w:type="dxa"/>
+            <w:tcMar>
+              <w:top w:w="80" w:type="dxa"/>
+              <w:left w:w="100" w:type="dxa"/>
+              <w:bottom w:w="80" w:type="dxa"/>
+              <w:right w:w="100" w:type="dxa"/>
+            </w:tcMar>
+          </w:tcPr>
+          <w:p>
+            <w:r>
+              <w:t>Employee's gender.</w:t>
+            </w:r>
+          </w:p>
+        </w:tc>
+      </w:tr>
+      <w:tr>
+        <w:tc>
+          <w:tcPr>
+            <w:tcW w:w="2400" w:type="dxa"/>
+            <w:tcMar>
+              <w:top w:w="80" w:type="dxa"/>
+              <w:left w:w="100" w:type="dxa"/>
+              <w:bottom w:w="80" w:type="dxa"/>
+              <w:right w:w="100" w:type="dxa"/>
+            </w:tcMar>
+          </w:tcPr>
+          <w:p>
+            <w:pPr>
+              <w:rPr>
+                <w:rFonts w:ascii="Consolas" w:hAnsi="Consolas"/>
+              </w:rPr>
+            </w:pPr>
+            <w:r>
+              <w:rPr>
+                <w:rFonts w:ascii="Consolas" w:hAnsi="Consolas"/>
+              </w:rPr>
+              <w:t>HourlyRate</w:t>
+            </w:r>
+          </w:p>
+        </w:tc>
+        <w:tc>
+          <w:tcPr>
+            <w:tcW w:w="7600" w:type="dxa"/>
+            <w:tcMar>
+              <w:top w:w="80" w:type="dxa"/>
+              <w:left w:w="100" w:type="dxa"/>
+              <w:bottom w:w="80" w:type="dxa"/>
+              <w:right w:w="100" w:type="dxa"/>
+            </w:tcMar>
+          </w:tcPr>
+          <w:p>
+            <w:r>
+              <w:t>Employee's hourly pay rate.</w:t>
+            </w:r>
+          </w:p>
+        </w:tc>
+      </w:tr>
+      <w:tr>
+        <w:tc>
+          <w:tcPr>
+            <w:tcW w:w="2400" w:type="dxa"/>
+            <w:tcMar>
+              <w:top w:w="80" w:type="dxa"/>
+              <w:left w:w="100" w:type="dxa"/>
+              <w:bottom w:w="80" w:type="dxa"/>
+              <w:right w:w="100" w:type="dxa"/>
+            </w:tcMar>
+          </w:tcPr>
+          <w:p>
+            <w:pPr>
+              <w:rPr>
+                <w:rFonts w:ascii="Consolas" w:hAnsi="Consolas"/>
+              </w:rPr>
+            </w:pPr>
+            <w:r>
+              <w:rPr>
+                <w:rFonts w:ascii="Consolas" w:hAnsi="Consolas"/>
+              </w:rPr>
+              <w:lastRenderedPageBreak/>
+              <w:t>JobInvolvement</w:t>
+            </w:r>
+          </w:p>
+        </w:tc>
+        <w:tc>
+          <w:tcPr>
+            <w:tcW w:w="7600" w:type="dxa"/>
+            <w:tcMar>
+              <w:top w:w="80" w:type="dxa"/>
+              <w:left w:w="100" w:type="dxa"/>
+              <w:bottom w:w="80" w:type="dxa"/>
+              <w:right w:w="100" w:type="dxa"/>
+            </w:tcMar>
+          </w:tcPr>
+          <w:p>
+            <w:r>
+              <w:t>Level of involvement in the job (1 = Low, 4 = Very High).</w:t>
+            </w:r>
+          </w:p>
+        </w:tc>
+      </w:tr>
+      <w:tr>
+        <w:tc>
+          <w:tcPr>
+            <w:tcW w:w="2400" w:type="dxa"/>
+            <w:tcMar>
+              <w:top w:w="80" w:type="dxa"/>
+              <w:left w:w="100" w:type="dxa"/>
+              <w:bottom w:w="80" w:type="dxa"/>
+              <w:right w:w="100" w:type="dxa"/>
+            </w:tcMar>
+          </w:tcPr>
+          <w:p>
+            <w:pPr>
+              <w:rPr>
+                <w:rFonts w:ascii="Consolas" w:hAnsi="Consolas"/>
+              </w:rPr>
+            </w:pPr>
+            <w:r>
+              <w:rPr>
+                <w:rFonts w:ascii="Consolas" w:hAnsi="Consolas"/>
+              </w:rPr>
+              <w:t>JobLevel</w:t>
+            </w:r>
+          </w:p>
+        </w:tc>
+        <w:tc>
+          <w:tcPr>
+            <w:tcW w:w="7600" w:type="dxa"/>
+            <w:tcMar>
+              <w:top w:w="80" w:type="dxa"/>
+              <w:left w:w="100" w:type="dxa"/>
+              <w:bottom w:w="80" w:type="dxa"/>
+              <w:right w:w="100" w:type="dxa"/>
+            </w:tcMar>
+          </w:tcPr>
+          <w:p>
+            <w:r>
+              <w:t>Employee's job level within the organization.</w:t>
+            </w:r>
+          </w:p>
+        </w:tc>
+      </w:tr>
+      <w:tr>
+        <w:tc>
+          <w:tcPr>
+            <w:tcW w:w="2400" w:type="dxa"/>
+            <w:tcMar>
+              <w:top w:w="80" w:type="dxa"/>
+              <w:left w:w="100" w:type="dxa"/>
+              <w:bottom w:w="80" w:type="dxa"/>
+              <w:right w:w="100" w:type="dxa"/>
+            </w:tcMar>
+          </w:tcPr>
+          <w:p>
+            <w:pPr>
+              <w:rPr>
+                <w:rFonts w:ascii="Consolas" w:hAnsi="Consolas"/>
+              </w:rPr>
+            </w:pPr>
+            <w:r>
+              <w:rPr>
+                <w:rFonts w:ascii="Consolas" w:hAnsi="Consolas"/>
+              </w:rPr>
+              <w:t>JobRole</w:t>
+            </w:r>
+          </w:p>
+        </w:tc>
+        <w:tc>
+          <w:tcPr>
+            <w:tcW w:w="7600" w:type="dxa"/>
+            <w:tcMar>
+              <w:top w:w="80" w:type="dxa"/>
+              <w:left w:w="100" w:type="dxa"/>
+              <w:bottom w:w="80" w:type="dxa"/>
+              <w:right w:w="100" w:type="dxa"/>
+            </w:tcMar>
+          </w:tcPr>
+          <w:p>
+            <w:r>
+              <w:t>Employee's job position or role.</w:t>
+            </w:r>
+          </w:p>
+        </w:tc>
+      </w:tr>
+      <w:tr>
+        <w:tc>
+          <w:tcPr>
+            <w:tcW w:w="2400" w:type="dxa"/>
+            <w:tcMar>
+              <w:top w:w="80" w:type="dxa"/>
+              <w:left w:w="100" w:type="dxa"/>
+              <w:bottom w:w="80" w:type="dxa"/>
+              <w:right w:w="100" w:type="dxa"/>
+            </w:tcMar>
+          </w:tcPr>
+          <w:p>
+            <w:pPr>
+              <w:rPr>
+                <w:rFonts w:ascii="Consolas" w:hAnsi="Consolas"/>
+              </w:rPr>
+            </w:pPr>
+            <w:r>
+              <w:rPr>
+                <w:rFonts w:ascii="Consolas" w:hAnsi="Consolas"/>
+              </w:rPr>
+              <w:t>JobSatisfaction</w:t>
+            </w:r>
+          </w:p>
+        </w:tc>
+        <w:tc>
+          <w:tcPr>
+            <w:tcW w:w="7600" w:type="dxa"/>
+            <w:tcMar>
+              <w:top w:w="80" w:type="dxa"/>
+              <w:left w:w="100" w:type="dxa"/>
+              <w:bottom w:w="80" w:type="dxa"/>
+              <w:right w:w="100" w:type="dxa"/>
+            </w:tcMar>
+          </w:tcPr>
+          <w:p>
+            <w:r>
+              <w:t>Employee's satisfaction with their job (1 = Low, 4 = Very High).</w:t>
+            </w:r>
+          </w:p>
+        </w:tc>
+      </w:tr>
+      <w:tr>
+        <w:tc>
+          <w:tcPr>
+            <w:tcW w:w="2400" w:type="dxa"/>
+            <w:tcMar>
+              <w:top w:w="80" w:type="dxa"/>
+              <w:left w:w="100" w:type="dxa"/>
+              <w:bottom w:w="80" w:type="dxa"/>
+              <w:right w:w="100" w:type="dxa"/>
+            </w:tcMar>
+          </w:tcPr>
+          <w:p>
+            <w:pPr>
+              <w:rPr>
+                <w:rFonts w:ascii="Consolas" w:hAnsi="Consolas"/>
+              </w:rPr>
+            </w:pPr>
+            <w:r>
+              <w:rPr>
+                <w:rFonts w:ascii="Consolas" w:hAnsi="Consolas"/>
+              </w:rPr>
+              <w:t>MaritalStatus</w:t>
+            </w:r>
+          </w:p>
+        </w:tc>
+        <w:tc>
+          <w:tcPr>
+            <w:tcW w:w="7600" w:type="dxa"/>
+            <w:tcMar>
+              <w:top w:w="80" w:type="dxa"/>
+              <w:left w:w="100" w:type="dxa"/>
+              <w:bottom w:w="80" w:type="dxa"/>
+              <w:right w:w="100" w:type="dxa"/>
+            </w:tcMar>
+          </w:tcPr>
+          <w:p>
+            <w:r>
+              <w:t>Employee's marital status (</w:t>
+            </w:r>
             <w:r>
               <w:rPr>
                 <w:rFonts w:ascii="Consolas" w:hAnsi="Consolas"/>
                 <w:sz w:val="18"/>
                 <w:szCs w:val="18"/>
               </w:rPr>
-              <w:t xml:space="preserve">, </w:t>
-            </w:r>
-            <w:proofErr w:type="spellStart"/>
-            <w:r>
-              <w:rPr>
-                <w:rFonts w:ascii="Consolas" w:hAnsi="Consolas"/>
-                <w:sz w:val="18"/>
-                <w:szCs w:val="18"/>
-              </w:rPr>
-              <w:t>Travel_Frequently</w:t>
-            </w:r>
-            <w:proofErr w:type="spellEnd"/>
-            <w:r>
-              <w:rPr>
-                <w:rFonts w:ascii="Consolas" w:hAnsi="Consolas"/>
-                <w:sz w:val="18"/>
-                <w:szCs w:val="18"/>
-              </w:rPr>
-              <w:t>, Non-Travel</w:t>
+              <w:t>Single, Married, Divorced</w:t>
             </w:r>
             <w:r>
               <w:t>).</w:t>
@@ -539,12 +1083,6 @@
         </w:tc>
       </w:tr>
       <w:tr>
-        <w:tblPrEx>
-          <w:tblCellMar>
-            <w:top w:w="0" w:type="dxa"/>
-            <w:bottom w:w="0" w:type="dxa"/>
-          </w:tblCellMar>
-        </w:tblPrEx>
         <w:tc>
           <w:tcPr>
             <w:tcW w:w="2400" w:type="dxa"/>
@@ -561,14 +1099,12 @@
                 <w:rFonts w:ascii="Consolas" w:hAnsi="Consolas"/>
               </w:rPr>
             </w:pPr>
-            <w:proofErr w:type="spellStart"/>
-            <w:r>
-              <w:rPr>
-                <w:rFonts w:ascii="Consolas" w:hAnsi="Consolas"/>
-              </w:rPr>
-              <w:t>DailyRate</w:t>
-            </w:r>
-            <w:proofErr w:type="spellEnd"/>
+            <w:r>
+              <w:rPr>
+                <w:rFonts w:ascii="Consolas" w:hAnsi="Consolas"/>
+              </w:rPr>
+              <w:t>MonthlyIncome</w:t>
+            </w:r>
           </w:p>
         </w:tc>
         <w:tc>
@@ -583,18 +1119,12 @@
           </w:tcPr>
           <w:p>
             <w:r>
-              <w:t>Employee's daily salary rate.</w:t>
+              <w:t>Employee's monthly income.</w:t>
             </w:r>
           </w:p>
         </w:tc>
       </w:tr>
       <w:tr>
-        <w:tblPrEx>
-          <w:tblCellMar>
-            <w:top w:w="0" w:type="dxa"/>
-            <w:bottom w:w="0" w:type="dxa"/>
-          </w:tblCellMar>
-        </w:tblPrEx>
         <w:tc>
           <w:tcPr>
             <w:tcW w:w="2400" w:type="dxa"/>
@@ -615,7 +1145,7 @@
               <w:rPr>
                 <w:rFonts w:ascii="Consolas" w:hAnsi="Consolas"/>
               </w:rPr>
-              <w:t>Department</w:t>
+              <w:t>MonthlyRate</w:t>
             </w:r>
           </w:p>
         </w:tc>
@@ -631,18 +1161,12 @@
           </w:tcPr>
           <w:p>
             <w:r>
-              <w:t>Department where the employee works.</w:t>
+              <w:t>Monthly salary rate.</w:t>
             </w:r>
           </w:p>
         </w:tc>
       </w:tr>
       <w:tr>
-        <w:tblPrEx>
-          <w:tblCellMar>
-            <w:top w:w="0" w:type="dxa"/>
-            <w:bottom w:w="0" w:type="dxa"/>
-          </w:tblCellMar>
-        </w:tblPrEx>
         <w:tc>
           <w:tcPr>
             <w:tcW w:w="2400" w:type="dxa"/>
@@ -659,14 +1183,12 @@
                 <w:rFonts w:ascii="Consolas" w:hAnsi="Consolas"/>
               </w:rPr>
             </w:pPr>
-            <w:proofErr w:type="spellStart"/>
-            <w:r>
-              <w:rPr>
-                <w:rFonts w:ascii="Consolas" w:hAnsi="Consolas"/>
-              </w:rPr>
-              <w:t>DistanceFromHome</w:t>
-            </w:r>
-            <w:proofErr w:type="spellEnd"/>
+            <w:r>
+              <w:rPr>
+                <w:rFonts w:ascii="Consolas" w:hAnsi="Consolas"/>
+              </w:rPr>
+              <w:t>NumCompaniesWorked</w:t>
+            </w:r>
           </w:p>
         </w:tc>
         <w:tc>
@@ -681,18 +1203,12 @@
           </w:tcPr>
           <w:p>
             <w:r>
-              <w:t>Distance between the employee's home and workplace (in miles).</w:t>
+              <w:t>Number of companies the employee worked for before joining the current company.</w:t>
             </w:r>
           </w:p>
         </w:tc>
       </w:tr>
       <w:tr>
-        <w:tblPrEx>
-          <w:tblCellMar>
-            <w:top w:w="0" w:type="dxa"/>
-            <w:bottom w:w="0" w:type="dxa"/>
-          </w:tblCellMar>
-        </w:tblPrEx>
         <w:tc>
           <w:tcPr>
             <w:tcW w:w="2400" w:type="dxa"/>
@@ -713,7 +1229,7 @@
               <w:rPr>
                 <w:rFonts w:ascii="Consolas" w:hAnsi="Consolas"/>
               </w:rPr>
-              <w:t>Education</w:t>
+              <w:t>Over18</w:t>
             </w:r>
           </w:p>
         </w:tc>
@@ -729,18 +1245,12 @@
           </w:tcPr>
           <w:p>
             <w:r>
-              <w:t>Employee's education level (1 = Below College, 5 = Doctor).</w:t>
+              <w:t>Indicates whether the employee is over 18 years old (constant value).</w:t>
             </w:r>
           </w:p>
         </w:tc>
       </w:tr>
       <w:tr>
-        <w:tblPrEx>
-          <w:tblCellMar>
-            <w:top w:w="0" w:type="dxa"/>
-            <w:bottom w:w="0" w:type="dxa"/>
-          </w:tblCellMar>
-        </w:tblPrEx>
         <w:tc>
           <w:tcPr>
             <w:tcW w:w="2400" w:type="dxa"/>
@@ -757,14 +1267,12 @@
                 <w:rFonts w:ascii="Consolas" w:hAnsi="Consolas"/>
               </w:rPr>
             </w:pPr>
-            <w:proofErr w:type="spellStart"/>
-            <w:r>
-              <w:rPr>
-                <w:rFonts w:ascii="Consolas" w:hAnsi="Consolas"/>
-              </w:rPr>
-              <w:t>EducationField</w:t>
-            </w:r>
-            <w:proofErr w:type="spellEnd"/>
+            <w:r>
+              <w:rPr>
+                <w:rFonts w:ascii="Consolas" w:hAnsi="Consolas"/>
+              </w:rPr>
+              <w:t>OverTime</w:t>
+            </w:r>
           </w:p>
         </w:tc>
         <w:tc>
@@ -779,18 +1287,12 @@
           </w:tcPr>
           <w:p>
             <w:r>
-              <w:t>Field of study or educational specialization.</w:t>
+              <w:t>Indicates whether the employee works overtime (Yes/No).</w:t>
             </w:r>
           </w:p>
         </w:tc>
       </w:tr>
       <w:tr>
-        <w:tblPrEx>
-          <w:tblCellMar>
-            <w:top w:w="0" w:type="dxa"/>
-            <w:bottom w:w="0" w:type="dxa"/>
-          </w:tblCellMar>
-        </w:tblPrEx>
         <w:tc>
           <w:tcPr>
             <w:tcW w:w="2400" w:type="dxa"/>
@@ -807,14 +1309,12 @@
                 <w:rFonts w:ascii="Consolas" w:hAnsi="Consolas"/>
               </w:rPr>
             </w:pPr>
-            <w:proofErr w:type="spellStart"/>
-            <w:r>
-              <w:rPr>
-                <w:rFonts w:ascii="Consolas" w:hAnsi="Consolas"/>
-              </w:rPr>
-              <w:t>EmployeeCount</w:t>
-            </w:r>
-            <w:proofErr w:type="spellEnd"/>
+            <w:r>
+              <w:rPr>
+                <w:rFonts w:ascii="Consolas" w:hAnsi="Consolas"/>
+              </w:rPr>
+              <w:t>PercentSalaryHike</w:t>
+            </w:r>
           </w:p>
         </w:tc>
         <w:tc>
@@ -829,18 +1329,12 @@
           </w:tcPr>
           <w:p>
             <w:r>
-              <w:t>Number of employees (constant value, usually 1).</w:t>
+              <w:t>Percentage increase in salary from the previous year.</w:t>
             </w:r>
           </w:p>
         </w:tc>
       </w:tr>
       <w:tr>
-        <w:tblPrEx>
-          <w:tblCellMar>
-            <w:top w:w="0" w:type="dxa"/>
-            <w:bottom w:w="0" w:type="dxa"/>
-          </w:tblCellMar>
-        </w:tblPrEx>
         <w:tc>
           <w:tcPr>
             <w:tcW w:w="2400" w:type="dxa"/>
@@ -857,14 +1351,12 @@
                 <w:rFonts w:ascii="Consolas" w:hAnsi="Consolas"/>
               </w:rPr>
             </w:pPr>
-            <w:proofErr w:type="spellStart"/>
-            <w:r>
-              <w:rPr>
-                <w:rFonts w:ascii="Consolas" w:hAnsi="Consolas"/>
-              </w:rPr>
-              <w:t>EmployeeNumber</w:t>
-            </w:r>
-            <w:proofErr w:type="spellEnd"/>
+            <w:r>
+              <w:rPr>
+                <w:rFonts w:ascii="Consolas" w:hAnsi="Consolas"/>
+              </w:rPr>
+              <w:t>PerformanceRating</w:t>
+            </w:r>
           </w:p>
         </w:tc>
         <w:tc>
@@ -879,18 +1371,12 @@
           </w:tcPr>
           <w:p>
             <w:r>
-              <w:t>Unique identifier assigned to each employee.</w:t>
+              <w:t>Employee's performance rating (3 = Good, 4 = Excellent).</w:t>
             </w:r>
           </w:p>
         </w:tc>
       </w:tr>
       <w:tr>
-        <w:tblPrEx>
-          <w:tblCellMar>
-            <w:top w:w="0" w:type="dxa"/>
-            <w:bottom w:w="0" w:type="dxa"/>
-          </w:tblCellMar>
-        </w:tblPrEx>
         <w:tc>
           <w:tcPr>
             <w:tcW w:w="2400" w:type="dxa"/>
@@ -907,14 +1393,12 @@
                 <w:rFonts w:ascii="Consolas" w:hAnsi="Consolas"/>
               </w:rPr>
             </w:pPr>
-            <w:proofErr w:type="spellStart"/>
-            <w:r>
-              <w:rPr>
-                <w:rFonts w:ascii="Consolas" w:hAnsi="Consolas"/>
-              </w:rPr>
-              <w:t>EnvironmentSatisfaction</w:t>
-            </w:r>
-            <w:proofErr w:type="spellEnd"/>
+            <w:r>
+              <w:rPr>
+                <w:rFonts w:ascii="Consolas" w:hAnsi="Consolas"/>
+              </w:rPr>
+              <w:t>RelationshipSatisfaction</w:t>
+            </w:r>
           </w:p>
         </w:tc>
         <w:tc>
@@ -929,18 +1413,12 @@
           </w:tcPr>
           <w:p>
             <w:r>
-              <w:t>Employee's satisfaction with the work environment (1 = Low, 4 = Very High).</w:t>
+              <w:t>Employee's satisfaction with workplace relationships (1 = Low, 4 = Very High).</w:t>
             </w:r>
           </w:p>
         </w:tc>
       </w:tr>
       <w:tr>
-        <w:tblPrEx>
-          <w:tblCellMar>
-            <w:top w:w="0" w:type="dxa"/>
-            <w:bottom w:w="0" w:type="dxa"/>
-          </w:tblCellMar>
-        </w:tblPrEx>
         <w:tc>
           <w:tcPr>
             <w:tcW w:w="2400" w:type="dxa"/>
@@ -961,7 +1439,7 @@
               <w:rPr>
                 <w:rFonts w:ascii="Consolas" w:hAnsi="Consolas"/>
               </w:rPr>
-              <w:t>Gender</w:t>
+              <w:t>StandardHours</w:t>
             </w:r>
           </w:p>
         </w:tc>
@@ -977,18 +1455,12 @@
           </w:tcPr>
           <w:p>
             <w:r>
-              <w:t>Employee's gender.</w:t>
+              <w:t>Standard working hours (constant value).</w:t>
             </w:r>
           </w:p>
         </w:tc>
       </w:tr>
       <w:tr>
-        <w:tblPrEx>
-          <w:tblCellMar>
-            <w:top w:w="0" w:type="dxa"/>
-            <w:bottom w:w="0" w:type="dxa"/>
-          </w:tblCellMar>
-        </w:tblPrEx>
         <w:tc>
           <w:tcPr>
             <w:tcW w:w="2400" w:type="dxa"/>
@@ -1005,14 +1477,12 @@
                 <w:rFonts w:ascii="Consolas" w:hAnsi="Consolas"/>
               </w:rPr>
             </w:pPr>
-            <w:proofErr w:type="spellStart"/>
-            <w:r>
-              <w:rPr>
-                <w:rFonts w:ascii="Consolas" w:hAnsi="Consolas"/>
-              </w:rPr>
-              <w:t>HourlyRate</w:t>
-            </w:r>
-            <w:proofErr w:type="spellEnd"/>
+            <w:r>
+              <w:rPr>
+                <w:rFonts w:ascii="Consolas" w:hAnsi="Consolas"/>
+              </w:rPr>
+              <w:t>StockOptionLevel</w:t>
+            </w:r>
           </w:p>
         </w:tc>
         <w:tc>
@@ -1027,18 +1497,12 @@
           </w:tcPr>
           <w:p>
             <w:r>
-              <w:t>Employee's hourly pay rate.</w:t>
+              <w:t>Employee's stock option level.</w:t>
             </w:r>
           </w:p>
         </w:tc>
       </w:tr>
       <w:tr>
-        <w:tblPrEx>
-          <w:tblCellMar>
-            <w:top w:w="0" w:type="dxa"/>
-            <w:bottom w:w="0" w:type="dxa"/>
-          </w:tblCellMar>
-        </w:tblPrEx>
         <w:tc>
           <w:tcPr>
             <w:tcW w:w="2400" w:type="dxa"/>
@@ -1055,15 +1519,12 @@
                 <w:rFonts w:ascii="Consolas" w:hAnsi="Consolas"/>
               </w:rPr>
             </w:pPr>
-            <w:proofErr w:type="spellStart"/>
-            <w:r>
-              <w:rPr>
-                <w:rFonts w:ascii="Consolas" w:hAnsi="Consolas"/>
-              </w:rPr>
-              <w:lastRenderedPageBreak/>
-              <w:t>JobInvolvement</w:t>
-            </w:r>
-            <w:proofErr w:type="spellEnd"/>
+            <w:r>
+              <w:rPr>
+                <w:rFonts w:ascii="Consolas" w:hAnsi="Consolas"/>
+              </w:rPr>
+              <w:t>TotalWorkingYears</w:t>
+            </w:r>
           </w:p>
         </w:tc>
         <w:tc>
@@ -1078,18 +1539,12 @@
           </w:tcPr>
           <w:p>
             <w:r>
-              <w:t>Level of involvement in the job (1 = Low, 4 = Very High).</w:t>
+              <w:t>Total years of professional work experience.</w:t>
             </w:r>
           </w:p>
         </w:tc>
       </w:tr>
       <w:tr>
-        <w:tblPrEx>
-          <w:tblCellMar>
-            <w:top w:w="0" w:type="dxa"/>
-            <w:bottom w:w="0" w:type="dxa"/>
-          </w:tblCellMar>
-        </w:tblPrEx>
         <w:tc>
           <w:tcPr>
             <w:tcW w:w="2400" w:type="dxa"/>
@@ -1106,14 +1561,12 @@
                 <w:rFonts w:ascii="Consolas" w:hAnsi="Consolas"/>
               </w:rPr>
             </w:pPr>
-            <w:proofErr w:type="spellStart"/>
-            <w:r>
-              <w:rPr>
-                <w:rFonts w:ascii="Consolas" w:hAnsi="Consolas"/>
-              </w:rPr>
-              <w:t>JobLevel</w:t>
-            </w:r>
-            <w:proofErr w:type="spellEnd"/>
+            <w:r>
+              <w:rPr>
+                <w:rFonts w:ascii="Consolas" w:hAnsi="Consolas"/>
+              </w:rPr>
+              <w:t>TrainingTimesLastYear</w:t>
+            </w:r>
           </w:p>
         </w:tc>
         <w:tc>
@@ -1128,18 +1581,12 @@
           </w:tcPr>
           <w:p>
             <w:r>
-              <w:t>Employee's job level within the organization.</w:t>
+              <w:t>Number of training sessions attended during the last year.</w:t>
             </w:r>
           </w:p>
         </w:tc>
       </w:tr>
       <w:tr>
-        <w:tblPrEx>
-          <w:tblCellMar>
-            <w:top w:w="0" w:type="dxa"/>
-            <w:bottom w:w="0" w:type="dxa"/>
-          </w:tblCellMar>
-        </w:tblPrEx>
         <w:tc>
           <w:tcPr>
             <w:tcW w:w="2400" w:type="dxa"/>
@@ -1156,14 +1603,12 @@
                 <w:rFonts w:ascii="Consolas" w:hAnsi="Consolas"/>
               </w:rPr>
             </w:pPr>
-            <w:proofErr w:type="spellStart"/>
-            <w:r>
-              <w:rPr>
-                <w:rFonts w:ascii="Consolas" w:hAnsi="Consolas"/>
-              </w:rPr>
-              <w:t>JobRole</w:t>
-            </w:r>
-            <w:proofErr w:type="spellEnd"/>
+            <w:r>
+              <w:rPr>
+                <w:rFonts w:ascii="Consolas" w:hAnsi="Consolas"/>
+              </w:rPr>
+              <w:t>WorkLifeBalance</w:t>
+            </w:r>
           </w:p>
         </w:tc>
         <w:tc>
@@ -1178,18 +1623,12 @@
           </w:tcPr>
           <w:p>
             <w:r>
-              <w:t>Employee's job position or role.</w:t>
+              <w:t>Employee's work-life balance rating (1 = Bad, 4 = Best).</w:t>
             </w:r>
           </w:p>
         </w:tc>
       </w:tr>
       <w:tr>
-        <w:tblPrEx>
-          <w:tblCellMar>
-            <w:top w:w="0" w:type="dxa"/>
-            <w:bottom w:w="0" w:type="dxa"/>
-          </w:tblCellMar>
-        </w:tblPrEx>
         <w:tc>
           <w:tcPr>
             <w:tcW w:w="2400" w:type="dxa"/>
@@ -1206,14 +1645,12 @@
                 <w:rFonts w:ascii="Consolas" w:hAnsi="Consolas"/>
               </w:rPr>
             </w:pPr>
-            <w:proofErr w:type="spellStart"/>
-            <w:r>
-              <w:rPr>
-                <w:rFonts w:ascii="Consolas" w:hAnsi="Consolas"/>
-              </w:rPr>
-              <w:t>JobSatisfaction</w:t>
-            </w:r>
-            <w:proofErr w:type="spellEnd"/>
+            <w:r>
+              <w:rPr>
+                <w:rFonts w:ascii="Consolas" w:hAnsi="Consolas"/>
+              </w:rPr>
+              <w:t>YearsAtCompany</w:t>
+            </w:r>
           </w:p>
         </w:tc>
         <w:tc>
@@ -1228,18 +1665,12 @@
           </w:tcPr>
           <w:p>
             <w:r>
-              <w:t>Employee's satisfaction with their job (1 = Low, 4 = Very High).</w:t>
+              <w:t>Number of years the employee has worked at the company.</w:t>
             </w:r>
           </w:p>
         </w:tc>
       </w:tr>
       <w:tr>
-        <w:tblPrEx>
-          <w:tblCellMar>
-            <w:top w:w="0" w:type="dxa"/>
-            <w:bottom w:w="0" w:type="dxa"/>
-          </w:tblCellMar>
-        </w:tblPrEx>
         <w:tc>
           <w:tcPr>
             <w:tcW w:w="2400" w:type="dxa"/>
@@ -1256,14 +1687,12 @@
                 <w:rFonts w:ascii="Consolas" w:hAnsi="Consolas"/>
               </w:rPr>
             </w:pPr>
-            <w:proofErr w:type="spellStart"/>
-            <w:r>
-              <w:rPr>
-                <w:rFonts w:ascii="Consolas" w:hAnsi="Consolas"/>
-              </w:rPr>
-              <w:t>MaritalStatus</w:t>
-            </w:r>
-            <w:proofErr w:type="spellEnd"/>
+            <w:r>
+              <w:rPr>
+                <w:rFonts w:ascii="Consolas" w:hAnsi="Consolas"/>
+              </w:rPr>
+              <w:t>YearsInCurrentRole</w:t>
+            </w:r>
           </w:p>
         </w:tc>
         <w:tc>
@@ -1278,29 +1707,12 @@
           </w:tcPr>
           <w:p>
             <w:r>
-              <w:t>Employee's marital status (</w:t>
-            </w:r>
-            <w:r>
-              <w:rPr>
-                <w:rFonts w:ascii="Consolas" w:hAnsi="Consolas"/>
-                <w:sz w:val="18"/>
-                <w:szCs w:val="18"/>
-              </w:rPr>
-              <w:t>Single, Married, Divorced</w:t>
-            </w:r>
-            <w:r>
-              <w:t>).</w:t>
+              <w:t>Number of years in the current job role.</w:t>
             </w:r>
           </w:p>
         </w:tc>
       </w:tr>
       <w:tr>
-        <w:tblPrEx>
-          <w:tblCellMar>
-            <w:top w:w="0" w:type="dxa"/>
-            <w:bottom w:w="0" w:type="dxa"/>
-          </w:tblCellMar>
-        </w:tblPrEx>
         <w:tc>
           <w:tcPr>
             <w:tcW w:w="2400" w:type="dxa"/>
@@ -1317,14 +1729,12 @@
                 <w:rFonts w:ascii="Consolas" w:hAnsi="Consolas"/>
               </w:rPr>
             </w:pPr>
-            <w:proofErr w:type="spellStart"/>
-            <w:r>
-              <w:rPr>
-                <w:rFonts w:ascii="Consolas" w:hAnsi="Consolas"/>
-              </w:rPr>
-              <w:t>MonthlyIncome</w:t>
-            </w:r>
-            <w:proofErr w:type="spellEnd"/>
+            <w:r>
+              <w:rPr>
+                <w:rFonts w:ascii="Consolas" w:hAnsi="Consolas"/>
+              </w:rPr>
+              <w:t>YearsSinceLastPromotion</w:t>
+            </w:r>
           </w:p>
         </w:tc>
         <w:tc>
@@ -1339,18 +1749,12 @@
           </w:tcPr>
           <w:p>
             <w:r>
-              <w:t>Employee's monthly income.</w:t>
+              <w:t>Number of years since the last promotion.</w:t>
             </w:r>
           </w:p>
         </w:tc>
       </w:tr>
       <w:tr>
-        <w:tblPrEx>
-          <w:tblCellMar>
-            <w:top w:w="0" w:type="dxa"/>
-            <w:bottom w:w="0" w:type="dxa"/>
-          </w:tblCellMar>
-        </w:tblPrEx>
         <w:tc>
           <w:tcPr>
             <w:tcW w:w="2400" w:type="dxa"/>
@@ -1367,762 +1771,12 @@
                 <w:rFonts w:ascii="Consolas" w:hAnsi="Consolas"/>
               </w:rPr>
             </w:pPr>
-            <w:proofErr w:type="spellStart"/>
-            <w:r>
-              <w:rPr>
-                <w:rFonts w:ascii="Consolas" w:hAnsi="Consolas"/>
-              </w:rPr>
-              <w:t>MonthlyRate</w:t>
-            </w:r>
-            <w:proofErr w:type="spellEnd"/>
-          </w:p>
-        </w:tc>
-        <w:tc>
-          <w:tcPr>
-            <w:tcW w:w="7600" w:type="dxa"/>
-            <w:tcMar>
-              <w:top w:w="80" w:type="dxa"/>
-              <w:left w:w="100" w:type="dxa"/>
-              <w:bottom w:w="80" w:type="dxa"/>
-              <w:right w:w="100" w:type="dxa"/>
-            </w:tcMar>
-          </w:tcPr>
-          <w:p>
-            <w:r>
-              <w:t>Monthly salary rate.</w:t>
-            </w:r>
-          </w:p>
-        </w:tc>
-      </w:tr>
-      <w:tr>
-        <w:tblPrEx>
-          <w:tblCellMar>
-            <w:top w:w="0" w:type="dxa"/>
-            <w:bottom w:w="0" w:type="dxa"/>
-          </w:tblCellMar>
-        </w:tblPrEx>
-        <w:tc>
-          <w:tcPr>
-            <w:tcW w:w="2400" w:type="dxa"/>
-            <w:tcMar>
-              <w:top w:w="80" w:type="dxa"/>
-              <w:left w:w="100" w:type="dxa"/>
-              <w:bottom w:w="80" w:type="dxa"/>
-              <w:right w:w="100" w:type="dxa"/>
-            </w:tcMar>
-          </w:tcPr>
-          <w:p>
-            <w:pPr>
-              <w:rPr>
-                <w:rFonts w:ascii="Consolas" w:hAnsi="Consolas"/>
-              </w:rPr>
-            </w:pPr>
-            <w:proofErr w:type="spellStart"/>
-            <w:r>
-              <w:rPr>
-                <w:rFonts w:ascii="Consolas" w:hAnsi="Consolas"/>
-              </w:rPr>
-              <w:t>NumCompaniesWorked</w:t>
-            </w:r>
-            <w:proofErr w:type="spellEnd"/>
-          </w:p>
-        </w:tc>
-        <w:tc>
-          <w:tcPr>
-            <w:tcW w:w="7600" w:type="dxa"/>
-            <w:tcMar>
-              <w:top w:w="80" w:type="dxa"/>
-              <w:left w:w="100" w:type="dxa"/>
-              <w:bottom w:w="80" w:type="dxa"/>
-              <w:right w:w="100" w:type="dxa"/>
-            </w:tcMar>
-          </w:tcPr>
-          <w:p>
-            <w:r>
-              <w:t>Number of companies the employee worked for before joining the current company.</w:t>
-            </w:r>
-          </w:p>
-        </w:tc>
-      </w:tr>
-      <w:tr>
-        <w:tblPrEx>
-          <w:tblCellMar>
-            <w:top w:w="0" w:type="dxa"/>
-            <w:bottom w:w="0" w:type="dxa"/>
-          </w:tblCellMar>
-        </w:tblPrEx>
-        <w:tc>
-          <w:tcPr>
-            <w:tcW w:w="2400" w:type="dxa"/>
-            <w:tcMar>
-              <w:top w:w="80" w:type="dxa"/>
-              <w:left w:w="100" w:type="dxa"/>
-              <w:bottom w:w="80" w:type="dxa"/>
-              <w:right w:w="100" w:type="dxa"/>
-            </w:tcMar>
-          </w:tcPr>
-          <w:p>
-            <w:pPr>
-              <w:rPr>
-                <w:rFonts w:ascii="Consolas" w:hAnsi="Consolas"/>
-              </w:rPr>
-            </w:pPr>
-            <w:r>
-              <w:rPr>
-                <w:rFonts w:ascii="Consolas" w:hAnsi="Consolas"/>
-              </w:rPr>
-              <w:t>Over18</w:t>
-            </w:r>
-          </w:p>
-        </w:tc>
-        <w:tc>
-          <w:tcPr>
-            <w:tcW w:w="7600" w:type="dxa"/>
-            <w:tcMar>
-              <w:top w:w="80" w:type="dxa"/>
-              <w:left w:w="100" w:type="dxa"/>
-              <w:bottom w:w="80" w:type="dxa"/>
-              <w:right w:w="100" w:type="dxa"/>
-            </w:tcMar>
-          </w:tcPr>
-          <w:p>
-            <w:r>
-              <w:t>Indicates whether the employee is over 18 years old (constant value).</w:t>
-            </w:r>
-          </w:p>
-        </w:tc>
-      </w:tr>
-      <w:tr>
-        <w:tblPrEx>
-          <w:tblCellMar>
-            <w:top w:w="0" w:type="dxa"/>
-            <w:bottom w:w="0" w:type="dxa"/>
-          </w:tblCellMar>
-        </w:tblPrEx>
-        <w:tc>
-          <w:tcPr>
-            <w:tcW w:w="2400" w:type="dxa"/>
-            <w:tcMar>
-              <w:top w:w="80" w:type="dxa"/>
-              <w:left w:w="100" w:type="dxa"/>
-              <w:bottom w:w="80" w:type="dxa"/>
-              <w:right w:w="100" w:type="dxa"/>
-            </w:tcMar>
-          </w:tcPr>
-          <w:p>
-            <w:pPr>
-              <w:rPr>
-                <w:rFonts w:ascii="Consolas" w:hAnsi="Consolas"/>
-              </w:rPr>
-            </w:pPr>
-            <w:proofErr w:type="spellStart"/>
-            <w:r>
-              <w:rPr>
-                <w:rFonts w:ascii="Consolas" w:hAnsi="Consolas"/>
-              </w:rPr>
-              <w:t>OverTime</w:t>
-            </w:r>
-            <w:proofErr w:type="spellEnd"/>
-          </w:p>
-        </w:tc>
-        <w:tc>
-          <w:tcPr>
-            <w:tcW w:w="7600" w:type="dxa"/>
-            <w:tcMar>
-              <w:top w:w="80" w:type="dxa"/>
-              <w:left w:w="100" w:type="dxa"/>
-              <w:bottom w:w="80" w:type="dxa"/>
-              <w:right w:w="100" w:type="dxa"/>
-            </w:tcMar>
-          </w:tcPr>
-          <w:p>
-            <w:r>
-              <w:t>Indicates whether the employee works overtime (Yes/No).</w:t>
-            </w:r>
-          </w:p>
-        </w:tc>
-      </w:tr>
-      <w:tr>
-        <w:tblPrEx>
-          <w:tblCellMar>
-            <w:top w:w="0" w:type="dxa"/>
-            <w:bottom w:w="0" w:type="dxa"/>
-          </w:tblCellMar>
-        </w:tblPrEx>
-        <w:tc>
-          <w:tcPr>
-            <w:tcW w:w="2400" w:type="dxa"/>
-            <w:tcMar>
-              <w:top w:w="80" w:type="dxa"/>
-              <w:left w:w="100" w:type="dxa"/>
-              <w:bottom w:w="80" w:type="dxa"/>
-              <w:right w:w="100" w:type="dxa"/>
-            </w:tcMar>
-          </w:tcPr>
-          <w:p>
-            <w:pPr>
-              <w:rPr>
-                <w:rFonts w:ascii="Consolas" w:hAnsi="Consolas"/>
-              </w:rPr>
-            </w:pPr>
-            <w:proofErr w:type="spellStart"/>
-            <w:r>
-              <w:rPr>
-                <w:rFonts w:ascii="Consolas" w:hAnsi="Consolas"/>
-              </w:rPr>
-              <w:t>PercentSalaryHike</w:t>
-            </w:r>
-            <w:proofErr w:type="spellEnd"/>
-          </w:p>
-        </w:tc>
-        <w:tc>
-          <w:tcPr>
-            <w:tcW w:w="7600" w:type="dxa"/>
-            <w:tcMar>
-              <w:top w:w="80" w:type="dxa"/>
-              <w:left w:w="100" w:type="dxa"/>
-              <w:bottom w:w="80" w:type="dxa"/>
-              <w:right w:w="100" w:type="dxa"/>
-            </w:tcMar>
-          </w:tcPr>
-          <w:p>
-            <w:r>
-              <w:t>Percentage increase in salary from the previous year.</w:t>
-            </w:r>
-          </w:p>
-        </w:tc>
-      </w:tr>
-      <w:tr>
-        <w:tblPrEx>
-          <w:tblCellMar>
-            <w:top w:w="0" w:type="dxa"/>
-            <w:bottom w:w="0" w:type="dxa"/>
-          </w:tblCellMar>
-        </w:tblPrEx>
-        <w:tc>
-          <w:tcPr>
-            <w:tcW w:w="2400" w:type="dxa"/>
-            <w:tcMar>
-              <w:top w:w="80" w:type="dxa"/>
-              <w:left w:w="100" w:type="dxa"/>
-              <w:bottom w:w="80" w:type="dxa"/>
-              <w:right w:w="100" w:type="dxa"/>
-            </w:tcMar>
-          </w:tcPr>
-          <w:p>
-            <w:pPr>
-              <w:rPr>
-                <w:rFonts w:ascii="Consolas" w:hAnsi="Consolas"/>
-              </w:rPr>
-            </w:pPr>
-            <w:proofErr w:type="spellStart"/>
-            <w:r>
-              <w:rPr>
-                <w:rFonts w:ascii="Consolas" w:hAnsi="Consolas"/>
-              </w:rPr>
-              <w:t>PerformanceRating</w:t>
-            </w:r>
-            <w:proofErr w:type="spellEnd"/>
-          </w:p>
-        </w:tc>
-        <w:tc>
-          <w:tcPr>
-            <w:tcW w:w="7600" w:type="dxa"/>
-            <w:tcMar>
-              <w:top w:w="80" w:type="dxa"/>
-              <w:left w:w="100" w:type="dxa"/>
-              <w:bottom w:w="80" w:type="dxa"/>
-              <w:right w:w="100" w:type="dxa"/>
-            </w:tcMar>
-          </w:tcPr>
-          <w:p>
-            <w:r>
-              <w:t>Employee's performance rating (3 = Good, 4 = Excellent).</w:t>
-            </w:r>
-          </w:p>
-        </w:tc>
-      </w:tr>
-      <w:tr>
-        <w:tblPrEx>
-          <w:tblCellMar>
-            <w:top w:w="0" w:type="dxa"/>
-            <w:bottom w:w="0" w:type="dxa"/>
-          </w:tblCellMar>
-        </w:tblPrEx>
-        <w:tc>
-          <w:tcPr>
-            <w:tcW w:w="2400" w:type="dxa"/>
-            <w:tcMar>
-              <w:top w:w="80" w:type="dxa"/>
-              <w:left w:w="100" w:type="dxa"/>
-              <w:bottom w:w="80" w:type="dxa"/>
-              <w:right w:w="100" w:type="dxa"/>
-            </w:tcMar>
-          </w:tcPr>
-          <w:p>
-            <w:pPr>
-              <w:rPr>
-                <w:rFonts w:ascii="Consolas" w:hAnsi="Consolas"/>
-              </w:rPr>
-            </w:pPr>
-            <w:proofErr w:type="spellStart"/>
-            <w:r>
-              <w:rPr>
-                <w:rFonts w:ascii="Consolas" w:hAnsi="Consolas"/>
-              </w:rPr>
-              <w:t>RelationshipSatisfaction</w:t>
-            </w:r>
-            <w:proofErr w:type="spellEnd"/>
-          </w:p>
-        </w:tc>
-        <w:tc>
-          <w:tcPr>
-            <w:tcW w:w="7600" w:type="dxa"/>
-            <w:tcMar>
-              <w:top w:w="80" w:type="dxa"/>
-              <w:left w:w="100" w:type="dxa"/>
-              <w:bottom w:w="80" w:type="dxa"/>
-              <w:right w:w="100" w:type="dxa"/>
-            </w:tcMar>
-          </w:tcPr>
-          <w:p>
-            <w:r>
-              <w:t>Employee's satisfaction with workplace relationships (1 = Low, 4 = Very High).</w:t>
-            </w:r>
-          </w:p>
-        </w:tc>
-      </w:tr>
-      <w:tr>
-        <w:tblPrEx>
-          <w:tblCellMar>
-            <w:top w:w="0" w:type="dxa"/>
-            <w:bottom w:w="0" w:type="dxa"/>
-          </w:tblCellMar>
-        </w:tblPrEx>
-        <w:tc>
-          <w:tcPr>
-            <w:tcW w:w="2400" w:type="dxa"/>
-            <w:tcMar>
-              <w:top w:w="80" w:type="dxa"/>
-              <w:left w:w="100" w:type="dxa"/>
-              <w:bottom w:w="80" w:type="dxa"/>
-              <w:right w:w="100" w:type="dxa"/>
-            </w:tcMar>
-          </w:tcPr>
-          <w:p>
-            <w:pPr>
-              <w:rPr>
-                <w:rFonts w:ascii="Consolas" w:hAnsi="Consolas"/>
-              </w:rPr>
-            </w:pPr>
-            <w:proofErr w:type="spellStart"/>
-            <w:r>
-              <w:rPr>
-                <w:rFonts w:ascii="Consolas" w:hAnsi="Consolas"/>
-              </w:rPr>
-              <w:t>StandardHours</w:t>
-            </w:r>
-            <w:proofErr w:type="spellEnd"/>
-          </w:p>
-        </w:tc>
-        <w:tc>
-          <w:tcPr>
-            <w:tcW w:w="7600" w:type="dxa"/>
-            <w:tcMar>
-              <w:top w:w="80" w:type="dxa"/>
-              <w:left w:w="100" w:type="dxa"/>
-              <w:bottom w:w="80" w:type="dxa"/>
-              <w:right w:w="100" w:type="dxa"/>
-            </w:tcMar>
-          </w:tcPr>
-          <w:p>
-            <w:r>
-              <w:t>Standard working hours (constant value).</w:t>
-            </w:r>
-          </w:p>
-        </w:tc>
-      </w:tr>
-      <w:tr>
-        <w:tblPrEx>
-          <w:tblCellMar>
-            <w:top w:w="0" w:type="dxa"/>
-            <w:bottom w:w="0" w:type="dxa"/>
-          </w:tblCellMar>
-        </w:tblPrEx>
-        <w:tc>
-          <w:tcPr>
-            <w:tcW w:w="2400" w:type="dxa"/>
-            <w:tcMar>
-              <w:top w:w="80" w:type="dxa"/>
-              <w:left w:w="100" w:type="dxa"/>
-              <w:bottom w:w="80" w:type="dxa"/>
-              <w:right w:w="100" w:type="dxa"/>
-            </w:tcMar>
-          </w:tcPr>
-          <w:p>
-            <w:pPr>
-              <w:rPr>
-                <w:rFonts w:ascii="Consolas" w:hAnsi="Consolas"/>
-              </w:rPr>
-            </w:pPr>
-            <w:proofErr w:type="spellStart"/>
-            <w:r>
-              <w:rPr>
-                <w:rFonts w:ascii="Consolas" w:hAnsi="Consolas"/>
-              </w:rPr>
-              <w:t>StockOptionLevel</w:t>
-            </w:r>
-            <w:proofErr w:type="spellEnd"/>
-          </w:p>
-        </w:tc>
-        <w:tc>
-          <w:tcPr>
-            <w:tcW w:w="7600" w:type="dxa"/>
-            <w:tcMar>
-              <w:top w:w="80" w:type="dxa"/>
-              <w:left w:w="100" w:type="dxa"/>
-              <w:bottom w:w="80" w:type="dxa"/>
-              <w:right w:w="100" w:type="dxa"/>
-            </w:tcMar>
-          </w:tcPr>
-          <w:p>
-            <w:r>
-              <w:t>Employee's stock option level.</w:t>
-            </w:r>
-          </w:p>
-        </w:tc>
-      </w:tr>
-      <w:tr>
-        <w:tblPrEx>
-          <w:tblCellMar>
-            <w:top w:w="0" w:type="dxa"/>
-            <w:bottom w:w="0" w:type="dxa"/>
-          </w:tblCellMar>
-        </w:tblPrEx>
-        <w:tc>
-          <w:tcPr>
-            <w:tcW w:w="2400" w:type="dxa"/>
-            <w:tcMar>
-              <w:top w:w="80" w:type="dxa"/>
-              <w:left w:w="100" w:type="dxa"/>
-              <w:bottom w:w="80" w:type="dxa"/>
-              <w:right w:w="100" w:type="dxa"/>
-            </w:tcMar>
-          </w:tcPr>
-          <w:p>
-            <w:pPr>
-              <w:rPr>
-                <w:rFonts w:ascii="Consolas" w:hAnsi="Consolas"/>
-              </w:rPr>
-            </w:pPr>
-            <w:proofErr w:type="spellStart"/>
-            <w:r>
-              <w:rPr>
-                <w:rFonts w:ascii="Consolas" w:hAnsi="Consolas"/>
-              </w:rPr>
-              <w:t>TotalWorkingYears</w:t>
-            </w:r>
-            <w:proofErr w:type="spellEnd"/>
-          </w:p>
-        </w:tc>
-        <w:tc>
-          <w:tcPr>
-            <w:tcW w:w="7600" w:type="dxa"/>
-            <w:tcMar>
-              <w:top w:w="80" w:type="dxa"/>
-              <w:left w:w="100" w:type="dxa"/>
-              <w:bottom w:w="80" w:type="dxa"/>
-              <w:right w:w="100" w:type="dxa"/>
-            </w:tcMar>
-          </w:tcPr>
-          <w:p>
-            <w:r>
-              <w:t>Total years of professional work experience.</w:t>
-            </w:r>
-          </w:p>
-        </w:tc>
-      </w:tr>
-      <w:tr>
-        <w:tblPrEx>
-          <w:tblCellMar>
-            <w:top w:w="0" w:type="dxa"/>
-            <w:bottom w:w="0" w:type="dxa"/>
-          </w:tblCellMar>
-        </w:tblPrEx>
-        <w:tc>
-          <w:tcPr>
-            <w:tcW w:w="2400" w:type="dxa"/>
-            <w:tcMar>
-              <w:top w:w="80" w:type="dxa"/>
-              <w:left w:w="100" w:type="dxa"/>
-              <w:bottom w:w="80" w:type="dxa"/>
-              <w:right w:w="100" w:type="dxa"/>
-            </w:tcMar>
-          </w:tcPr>
-          <w:p>
-            <w:pPr>
-              <w:rPr>
-                <w:rFonts w:ascii="Consolas" w:hAnsi="Consolas"/>
-              </w:rPr>
-            </w:pPr>
-            <w:proofErr w:type="spellStart"/>
-            <w:r>
-              <w:rPr>
-                <w:rFonts w:ascii="Consolas" w:hAnsi="Consolas"/>
-              </w:rPr>
-              <w:t>TrainingTimesLastYear</w:t>
-            </w:r>
-            <w:proofErr w:type="spellEnd"/>
-          </w:p>
-        </w:tc>
-        <w:tc>
-          <w:tcPr>
-            <w:tcW w:w="7600" w:type="dxa"/>
-            <w:tcMar>
-              <w:top w:w="80" w:type="dxa"/>
-              <w:left w:w="100" w:type="dxa"/>
-              <w:bottom w:w="80" w:type="dxa"/>
-              <w:right w:w="100" w:type="dxa"/>
-            </w:tcMar>
-          </w:tcPr>
-          <w:p>
-            <w:r>
-              <w:t>Number of training sessions attended during the last year.</w:t>
-            </w:r>
-          </w:p>
-        </w:tc>
-      </w:tr>
-      <w:tr>
-        <w:tblPrEx>
-          <w:tblCellMar>
-            <w:top w:w="0" w:type="dxa"/>
-            <w:bottom w:w="0" w:type="dxa"/>
-          </w:tblCellMar>
-        </w:tblPrEx>
-        <w:tc>
-          <w:tcPr>
-            <w:tcW w:w="2400" w:type="dxa"/>
-            <w:tcMar>
-              <w:top w:w="80" w:type="dxa"/>
-              <w:left w:w="100" w:type="dxa"/>
-              <w:bottom w:w="80" w:type="dxa"/>
-              <w:right w:w="100" w:type="dxa"/>
-            </w:tcMar>
-          </w:tcPr>
-          <w:p>
-            <w:pPr>
-              <w:rPr>
-                <w:rFonts w:ascii="Consolas" w:hAnsi="Consolas"/>
-              </w:rPr>
-            </w:pPr>
-            <w:proofErr w:type="spellStart"/>
-            <w:r>
-              <w:rPr>
-                <w:rFonts w:ascii="Consolas" w:hAnsi="Consolas"/>
-              </w:rPr>
-              <w:t>WorkLifeBalance</w:t>
-            </w:r>
-            <w:proofErr w:type="spellEnd"/>
-          </w:p>
-        </w:tc>
-        <w:tc>
-          <w:tcPr>
-            <w:tcW w:w="7600" w:type="dxa"/>
-            <w:tcMar>
-              <w:top w:w="80" w:type="dxa"/>
-              <w:left w:w="100" w:type="dxa"/>
-              <w:bottom w:w="80" w:type="dxa"/>
-              <w:right w:w="100" w:type="dxa"/>
-            </w:tcMar>
-          </w:tcPr>
-          <w:p>
-            <w:r>
-              <w:t>Employee's work-life balance rating (1 = Bad, 4 = Best).</w:t>
-            </w:r>
-          </w:p>
-        </w:tc>
-      </w:tr>
-      <w:tr>
-        <w:tblPrEx>
-          <w:tblCellMar>
-            <w:top w:w="0" w:type="dxa"/>
-            <w:bottom w:w="0" w:type="dxa"/>
-          </w:tblCellMar>
-        </w:tblPrEx>
-        <w:tc>
-          <w:tcPr>
-            <w:tcW w:w="2400" w:type="dxa"/>
-            <w:tcMar>
-              <w:top w:w="80" w:type="dxa"/>
-              <w:left w:w="100" w:type="dxa"/>
-              <w:bottom w:w="80" w:type="dxa"/>
-              <w:right w:w="100" w:type="dxa"/>
-            </w:tcMar>
-          </w:tcPr>
-          <w:p>
-            <w:pPr>
-              <w:rPr>
-                <w:rFonts w:ascii="Consolas" w:hAnsi="Consolas"/>
-              </w:rPr>
-            </w:pPr>
-            <w:proofErr w:type="spellStart"/>
-            <w:r>
-              <w:rPr>
-                <w:rFonts w:ascii="Consolas" w:hAnsi="Consolas"/>
-              </w:rPr>
-              <w:t>YearsAtCompany</w:t>
-            </w:r>
-            <w:proofErr w:type="spellEnd"/>
-          </w:p>
-        </w:tc>
-        <w:tc>
-          <w:tcPr>
-            <w:tcW w:w="7600" w:type="dxa"/>
-            <w:tcMar>
-              <w:top w:w="80" w:type="dxa"/>
-              <w:left w:w="100" w:type="dxa"/>
-              <w:bottom w:w="80" w:type="dxa"/>
-              <w:right w:w="100" w:type="dxa"/>
-            </w:tcMar>
-          </w:tcPr>
-          <w:p>
-            <w:r>
-              <w:t>Number of years the employee has worked at the company.</w:t>
-            </w:r>
-          </w:p>
-        </w:tc>
-      </w:tr>
-      <w:tr>
-        <w:tblPrEx>
-          <w:tblCellMar>
-            <w:top w:w="0" w:type="dxa"/>
-            <w:bottom w:w="0" w:type="dxa"/>
-          </w:tblCellMar>
-        </w:tblPrEx>
-        <w:tc>
-          <w:tcPr>
-            <w:tcW w:w="2400" w:type="dxa"/>
-            <w:tcMar>
-              <w:top w:w="80" w:type="dxa"/>
-              <w:left w:w="100" w:type="dxa"/>
-              <w:bottom w:w="80" w:type="dxa"/>
-              <w:right w:w="100" w:type="dxa"/>
-            </w:tcMar>
-          </w:tcPr>
-          <w:p>
-            <w:pPr>
-              <w:rPr>
-                <w:rFonts w:ascii="Consolas" w:hAnsi="Consolas"/>
-              </w:rPr>
-            </w:pPr>
-            <w:proofErr w:type="spellStart"/>
-            <w:r>
-              <w:rPr>
-                <w:rFonts w:ascii="Consolas" w:hAnsi="Consolas"/>
-              </w:rPr>
-              <w:t>YearsInCurrentRole</w:t>
-            </w:r>
-            <w:proofErr w:type="spellEnd"/>
-          </w:p>
-        </w:tc>
-        <w:tc>
-          <w:tcPr>
-            <w:tcW w:w="7600" w:type="dxa"/>
-            <w:tcMar>
-              <w:top w:w="80" w:type="dxa"/>
-              <w:left w:w="100" w:type="dxa"/>
-              <w:bottom w:w="80" w:type="dxa"/>
-              <w:right w:w="100" w:type="dxa"/>
-            </w:tcMar>
-          </w:tcPr>
-          <w:p>
-            <w:r>
-              <w:t>Number of years in the current job role.</w:t>
-            </w:r>
-          </w:p>
-        </w:tc>
-      </w:tr>
-      <w:tr>
-        <w:tblPrEx>
-          <w:tblCellMar>
-            <w:top w:w="0" w:type="dxa"/>
-            <w:bottom w:w="0" w:type="dxa"/>
-          </w:tblCellMar>
-        </w:tblPrEx>
-        <w:tc>
-          <w:tcPr>
-            <w:tcW w:w="2400" w:type="dxa"/>
-            <w:tcMar>
-              <w:top w:w="80" w:type="dxa"/>
-              <w:left w:w="100" w:type="dxa"/>
-              <w:bottom w:w="80" w:type="dxa"/>
-              <w:right w:w="100" w:type="dxa"/>
-            </w:tcMar>
-          </w:tcPr>
-          <w:p>
-            <w:pPr>
-              <w:rPr>
-                <w:rFonts w:ascii="Consolas" w:hAnsi="Consolas"/>
-              </w:rPr>
-            </w:pPr>
-            <w:proofErr w:type="spellStart"/>
-            <w:r>
-              <w:rPr>
-                <w:rFonts w:ascii="Consolas" w:hAnsi="Consolas"/>
-              </w:rPr>
-              <w:t>YearsSinceLastPromotion</w:t>
-            </w:r>
-            <w:proofErr w:type="spellEnd"/>
-          </w:p>
-        </w:tc>
-        <w:tc>
-          <w:tcPr>
-            <w:tcW w:w="7600" w:type="dxa"/>
-            <w:tcMar>
-              <w:top w:w="80" w:type="dxa"/>
-              <w:left w:w="100" w:type="dxa"/>
-              <w:bottom w:w="80" w:type="dxa"/>
-              <w:right w:w="100" w:type="dxa"/>
-            </w:tcMar>
-          </w:tcPr>
-          <w:p>
-            <w:r>
-              <w:t>Number of years since the last promotion.</w:t>
-            </w:r>
-          </w:p>
-        </w:tc>
-      </w:tr>
-      <w:tr>
-        <w:tblPrEx>
-          <w:tblCellMar>
-            <w:top w:w="0" w:type="dxa"/>
-            <w:bottom w:w="0" w:type="dxa"/>
-          </w:tblCellMar>
-        </w:tblPrEx>
-        <w:tc>
-          <w:tcPr>
-            <w:tcW w:w="2400" w:type="dxa"/>
-            <w:tcMar>
-              <w:top w:w="80" w:type="dxa"/>
-              <w:left w:w="100" w:type="dxa"/>
-              <w:bottom w:w="80" w:type="dxa"/>
-              <w:right w:w="100" w:type="dxa"/>
-            </w:tcMar>
-          </w:tcPr>
-          <w:p>
-            <w:pPr>
-              <w:rPr>
-                <w:rFonts w:ascii="Consolas" w:hAnsi="Consolas"/>
-              </w:rPr>
-            </w:pPr>
-            <w:proofErr w:type="spellStart"/>
             <w:r>
               <w:rPr>
                 <w:rFonts w:ascii="Consolas" w:hAnsi="Consolas"/>
               </w:rPr>
               <w:t>YearsWithCurrManager</w:t>
             </w:r>
-            <w:proofErr w:type="spellEnd"/>
           </w:p>
         </w:tc>
         <w:tc>
@@ -2152,21 +1806,7 @@
           <w:b/>
           <w:bCs/>
         </w:rPr>
-        <w:t xml:space="preserve">Understand the Dataset Structure </w:t>
-      </w:r>
-      <w:r>
-        <w:rPr>
-          <w:b/>
-          <w:bCs/>
-        </w:rPr>
-        <w:t>-</w:t>
-      </w:r>
-      <w:r>
-        <w:rPr>
-          <w:b/>
-          <w:bCs/>
-        </w:rPr>
-        <w:t xml:space="preserve"> Findings:</w:t>
+        <w:t>Understand the Dataset Structure - Findings:</w:t>
       </w:r>
     </w:p>
     <w:p>
@@ -2246,21 +1886,7 @@
           <w:b/>
           <w:bCs/>
         </w:rPr>
-        <w:t xml:space="preserve">2.1 Statistical Summary </w:t>
-      </w:r>
-      <w:r>
-        <w:rPr>
-          <w:b/>
-          <w:bCs/>
-        </w:rPr>
-        <w:t>-</w:t>
-      </w:r>
-      <w:r>
-        <w:rPr>
-          <w:b/>
-          <w:bCs/>
-        </w:rPr>
-        <w:t xml:space="preserve"> Findings:</w:t>
+        <w:t>2.1 Statistical Summary - Findings:</w:t>
       </w:r>
     </w:p>
     <w:p>
@@ -2309,21 +1935,7 @@
           <w:b/>
           <w:bCs/>
         </w:rPr>
-        <w:t xml:space="preserve">2.2 Missing Values </w:t>
-      </w:r>
-      <w:r>
-        <w:rPr>
-          <w:b/>
-          <w:bCs/>
-        </w:rPr>
-        <w:t>-</w:t>
-      </w:r>
-      <w:r>
-        <w:rPr>
-          <w:b/>
-          <w:bCs/>
-        </w:rPr>
-        <w:t xml:space="preserve"> Findings:</w:t>
+        <w:t>2.2 Missing Values - Findings:</w:t>
       </w:r>
     </w:p>
     <w:p>
@@ -2360,21 +1972,7 @@
           <w:b/>
           <w:bCs/>
         </w:rPr>
-        <w:t xml:space="preserve">2.3 Duplicate Records </w:t>
-      </w:r>
-      <w:r>
-        <w:rPr>
-          <w:b/>
-          <w:bCs/>
-        </w:rPr>
-        <w:t>-</w:t>
-      </w:r>
-      <w:r>
-        <w:rPr>
-          <w:b/>
-          <w:bCs/>
-        </w:rPr>
-        <w:t xml:space="preserve"> Findings:</w:t>
+        <w:t>2.3 Duplicate Records - Findings:</w:t>
       </w:r>
     </w:p>
     <w:p>
@@ -2399,21 +1997,7 @@
           <w:b/>
           <w:bCs/>
         </w:rPr>
-        <w:t xml:space="preserve">2.4 Class Imbalance </w:t>
-      </w:r>
-      <w:r>
-        <w:rPr>
-          <w:b/>
-          <w:bCs/>
-        </w:rPr>
-        <w:t>-</w:t>
-      </w:r>
-      <w:r>
-        <w:rPr>
-          <w:b/>
-          <w:bCs/>
-        </w:rPr>
-        <w:t xml:space="preserve"> Findings:</w:t>
+        <w:t>2.4 Class Imbalance - Findings:</w:t>
       </w:r>
     </w:p>
     <w:p>
@@ -2426,33 +2010,11 @@
         <w:spacing w:after="120"/>
         <w:jc w:val="center"/>
       </w:pPr>
-      <w:proofErr w:type="spellStart"/>
       <w:r>
         <w:rPr>
           <w:rFonts w:ascii="Consolas" w:hAnsi="Consolas"/>
         </w:rPr>
-        <w:t>df</w:t>
-      </w:r>
-      <w:proofErr w:type="spellEnd"/>
-      <w:r>
-        <w:rPr>
-          <w:rFonts w:ascii="Consolas" w:hAnsi="Consolas"/>
-        </w:rPr>
-        <w:t>["Attrition"].</w:t>
-      </w:r>
-      <w:proofErr w:type="spellStart"/>
-      <w:r>
-        <w:rPr>
-          <w:rFonts w:ascii="Consolas" w:hAnsi="Consolas"/>
-        </w:rPr>
-        <w:t>value_counts</w:t>
-      </w:r>
-      <w:proofErr w:type="spellEnd"/>
-      <w:r>
-        <w:rPr>
-          <w:rFonts w:ascii="Consolas" w:hAnsi="Consolas"/>
-        </w:rPr>
-        <w:t>(normalize=True) * 100</w:t>
+        <w:t>df["Attrition"].value_counts(normalize=True) * 100</w:t>
       </w:r>
       <w:r>
         <w:t>:</w:t>
@@ -2488,15 +2050,7 @@
         <w:spacing w:after="120"/>
       </w:pPr>
       <w:r>
-        <w:t xml:space="preserve">The target class is imbalanced roughly 5-to-1 in </w:t>
-      </w:r>
-      <w:proofErr w:type="spellStart"/>
-      <w:r>
-        <w:t>favor</w:t>
-      </w:r>
-      <w:proofErr w:type="spellEnd"/>
-      <w:r>
-        <w:t xml:space="preserve"> of retained employees, which is expected for attrition datasets and was kept in mind when interpreting group-level rates below.</w:t>
+        <w:t>The target class is imbalanced roughly 5-to-1 in favor of retained employees, which is expected for attrition datasets and was kept in mind when interpreting group-level rates below.</w:t>
       </w:r>
     </w:p>
     <w:p>
@@ -2553,47 +2107,321 @@
       <w:r>
         <w:t xml:space="preserve">Dropped: </w:t>
       </w:r>
+      <w:r>
+        <w:rPr>
+          <w:rFonts w:ascii="Consolas" w:hAnsi="Consolas"/>
+        </w:rPr>
+        <w:t>EmployeeCount</w:t>
+      </w:r>
+      <w:r>
+        <w:t xml:space="preserve">, </w:t>
+      </w:r>
+      <w:r>
+        <w:rPr>
+          <w:rFonts w:ascii="Consolas" w:hAnsi="Consolas"/>
+        </w:rPr>
+        <w:t>Over18</w:t>
+      </w:r>
+      <w:r>
+        <w:t xml:space="preserve">, </w:t>
+      </w:r>
+      <w:r>
+        <w:rPr>
+          <w:rFonts w:ascii="Consolas" w:hAnsi="Consolas"/>
+        </w:rPr>
+        <w:t>StandardHours</w:t>
+      </w:r>
+      <w:r>
+        <w:t xml:space="preserve"> (zero-variance) and </w:t>
+      </w:r>
+      <w:r>
+        <w:rPr>
+          <w:rFonts w:ascii="Consolas" w:hAnsi="Consolas"/>
+        </w:rPr>
+        <w:t>EmployeeNumber</w:t>
+      </w:r>
+      <w:r>
+        <w:t xml:space="preserve"> (ID column).</w:t>
+      </w:r>
+    </w:p>
+    <w:p>
+      <w:pPr>
+        <w:pStyle w:val="ListParagraph"/>
+        <w:numPr>
+          <w:ilvl w:val="0"/>
+          <w:numId w:val="2"/>
+        </w:numPr>
+        <w:spacing w:after="80"/>
+      </w:pPr>
+      <w:r>
+        <w:t>Resulting shape: 1,470 rows × 31 columns.</w:t>
+      </w:r>
+    </w:p>
+    <w:p>
+      <w:pPr>
+        <w:spacing w:before="200" w:after="100"/>
+      </w:pPr>
+      <w:r>
+        <w:rPr>
+          <w:b/>
+          <w:bCs/>
+        </w:rPr>
+        <w:t>3.2 Outlier Management (IQR Method)</w:t>
+      </w:r>
+    </w:p>
+    <w:p>
+      <w:pPr>
+        <w:spacing w:after="120"/>
+      </w:pPr>
+      <w:r>
+        <w:t>Continuous numeric columns (columns with more than 10 unique values) were checked for outliers using the 1.5×IQR rule.</w:t>
+      </w:r>
+    </w:p>
+    <w:p>
+      <w:pPr>
+        <w:pStyle w:val="ListParagraph"/>
+        <w:numPr>
+          <w:ilvl w:val="0"/>
+          <w:numId w:val="2"/>
+        </w:numPr>
+        <w:rPr>
+          <w:sz w:val="10"/>
+          <w:szCs w:val="10"/>
+        </w:rPr>
+      </w:pPr>
+      <w:r>
+        <w:t>Six continuous columns showed outliers under the 1.5</w:t>
+      </w:r>
+      <w:r>
+        <w:t xml:space="preserve"> </w:t>
+      </w:r>
+      <w:r>
+        <w:t>×</w:t>
+      </w:r>
+      <w:r>
+        <w:t xml:space="preserve"> </w:t>
+      </w:r>
+      <w:r>
+        <w:t xml:space="preserve">IQR rule: </w:t>
+      </w:r>
+      <w:r>
+        <w:br/>
+      </w:r>
       <w:proofErr w:type="spellStart"/>
       <w:r>
         <w:rPr>
           <w:rFonts w:ascii="Consolas" w:hAnsi="Consolas"/>
-        </w:rPr>
-        <w:t>EmployeeCount</w:t>
+          <w:sz w:val="18"/>
+          <w:szCs w:val="18"/>
+        </w:rPr>
+        <w:t>MonthlyIncome</w:t>
       </w:r>
       <w:proofErr w:type="spellEnd"/>
       <w:r>
+        <w:rPr>
+          <w:sz w:val="18"/>
+          <w:szCs w:val="18"/>
+        </w:rPr>
+        <w:t xml:space="preserve"> (114), </w:t>
+      </w:r>
+      <w:proofErr w:type="spellStart"/>
+      <w:r>
+        <w:rPr>
+          <w:rFonts w:ascii="Consolas" w:hAnsi="Consolas"/>
+          <w:sz w:val="18"/>
+          <w:szCs w:val="18"/>
+        </w:rPr>
+        <w:t>YearsSinceLastPromotion</w:t>
+      </w:r>
+      <w:proofErr w:type="spellEnd"/>
+      <w:r>
+        <w:rPr>
+          <w:sz w:val="18"/>
+          <w:szCs w:val="18"/>
+        </w:rPr>
+        <w:t xml:space="preserve"> (107), </w:t>
+      </w:r>
+      <w:proofErr w:type="spellStart"/>
+      <w:r>
+        <w:rPr>
+          <w:rFonts w:ascii="Consolas" w:hAnsi="Consolas"/>
+          <w:sz w:val="18"/>
+          <w:szCs w:val="18"/>
+        </w:rPr>
+        <w:t>YearsAtCompany</w:t>
+      </w:r>
+      <w:proofErr w:type="spellEnd"/>
+      <w:r>
+        <w:rPr>
+          <w:sz w:val="18"/>
+          <w:szCs w:val="18"/>
+        </w:rPr>
+        <w:t xml:space="preserve"> (104), </w:t>
+      </w:r>
+      <w:proofErr w:type="spellStart"/>
+      <w:r>
+        <w:rPr>
+          <w:rFonts w:ascii="Consolas" w:hAnsi="Consolas"/>
+          <w:sz w:val="18"/>
+          <w:szCs w:val="18"/>
+        </w:rPr>
+        <w:t>TotalWorkingYears</w:t>
+      </w:r>
+      <w:proofErr w:type="spellEnd"/>
+      <w:r>
+        <w:rPr>
+          <w:sz w:val="18"/>
+          <w:szCs w:val="18"/>
+        </w:rPr>
+        <w:t xml:space="preserve"> (63), </w:t>
+      </w:r>
+      <w:proofErr w:type="spellStart"/>
+      <w:r>
+        <w:rPr>
+          <w:rFonts w:ascii="Consolas" w:hAnsi="Consolas"/>
+          <w:sz w:val="18"/>
+          <w:szCs w:val="18"/>
+        </w:rPr>
+        <w:t>YearsInCurrentRole</w:t>
+      </w:r>
+      <w:proofErr w:type="spellEnd"/>
+      <w:r>
+        <w:rPr>
+          <w:sz w:val="18"/>
+          <w:szCs w:val="18"/>
+        </w:rPr>
+        <w:t xml:space="preserve"> (21), and </w:t>
+      </w:r>
+      <w:proofErr w:type="spellStart"/>
+      <w:r>
+        <w:rPr>
+          <w:rFonts w:ascii="Consolas" w:hAnsi="Consolas"/>
+          <w:sz w:val="18"/>
+          <w:szCs w:val="18"/>
+        </w:rPr>
+        <w:t>YearsWithCurrManager</w:t>
+      </w:r>
+      <w:proofErr w:type="spellEnd"/>
+      <w:r>
+        <w:rPr>
+          <w:sz w:val="18"/>
+          <w:szCs w:val="18"/>
+        </w:rPr>
+        <w:t xml:space="preserve"> (14); </w:t>
+      </w:r>
+      <w:r>
+        <w:rPr>
+          <w:sz w:val="18"/>
+          <w:szCs w:val="18"/>
+        </w:rPr>
+        <w:br/>
+      </w:r>
+      <w:r>
+        <w:rPr>
+          <w:rFonts w:ascii="Consolas" w:hAnsi="Consolas"/>
+          <w:sz w:val="18"/>
+          <w:szCs w:val="18"/>
+        </w:rPr>
+        <w:t>Age</w:t>
+      </w:r>
+      <w:r>
+        <w:rPr>
+          <w:sz w:val="18"/>
+          <w:szCs w:val="18"/>
+        </w:rPr>
         <w:t xml:space="preserve">, </w:t>
       </w:r>
+      <w:proofErr w:type="spellStart"/>
       <w:r>
         <w:rPr>
           <w:rFonts w:ascii="Consolas" w:hAnsi="Consolas"/>
-        </w:rPr>
-        <w:t>Over18</w:t>
-      </w:r>
-      <w:r>
+          <w:sz w:val="18"/>
+          <w:szCs w:val="18"/>
+        </w:rPr>
+        <w:t>DailyRate</w:t>
+      </w:r>
+      <w:proofErr w:type="spellEnd"/>
+      <w:r>
+        <w:rPr>
+          <w:sz w:val="18"/>
+          <w:szCs w:val="18"/>
+        </w:rPr>
         <w:t xml:space="preserve">, </w:t>
       </w:r>
       <w:proofErr w:type="spellStart"/>
       <w:r>
         <w:rPr>
           <w:rFonts w:ascii="Consolas" w:hAnsi="Consolas"/>
-        </w:rPr>
-        <w:t>StandardHours</w:t>
+          <w:sz w:val="18"/>
+          <w:szCs w:val="18"/>
+        </w:rPr>
+        <w:t>DistanceFromHome</w:t>
       </w:r>
       <w:proofErr w:type="spellEnd"/>
       <w:r>
-        <w:t xml:space="preserve"> (zero-variance) and </w:t>
+        <w:rPr>
+          <w:sz w:val="18"/>
+          <w:szCs w:val="18"/>
+        </w:rPr>
+        <w:t xml:space="preserve">, </w:t>
       </w:r>
       <w:proofErr w:type="spellStart"/>
       <w:r>
         <w:rPr>
           <w:rFonts w:ascii="Consolas" w:hAnsi="Consolas"/>
-        </w:rPr>
-        <w:t>EmployeeNumber</w:t>
+          <w:sz w:val="18"/>
+          <w:szCs w:val="18"/>
+        </w:rPr>
+        <w:t>HourlyRate</w:t>
       </w:r>
       <w:proofErr w:type="spellEnd"/>
       <w:r>
-        <w:t xml:space="preserve"> (ID column).</w:t>
+        <w:rPr>
+          <w:sz w:val="18"/>
+          <w:szCs w:val="18"/>
+        </w:rPr>
+        <w:t xml:space="preserve">, </w:t>
+      </w:r>
+      <w:proofErr w:type="spellStart"/>
+      <w:r>
+        <w:rPr>
+          <w:rFonts w:ascii="Consolas" w:hAnsi="Consolas"/>
+          <w:sz w:val="18"/>
+          <w:szCs w:val="18"/>
+        </w:rPr>
+        <w:t>MonthlyRate</w:t>
+      </w:r>
+      <w:proofErr w:type="spellEnd"/>
+      <w:r>
+        <w:rPr>
+          <w:sz w:val="18"/>
+          <w:szCs w:val="18"/>
+        </w:rPr>
+        <w:t xml:space="preserve">, and </w:t>
+      </w:r>
+      <w:proofErr w:type="spellStart"/>
+      <w:r>
+        <w:rPr>
+          <w:rFonts w:ascii="Consolas" w:hAnsi="Consolas"/>
+          <w:sz w:val="18"/>
+          <w:szCs w:val="18"/>
+        </w:rPr>
+        <w:t>PercentSalaryHike</w:t>
+      </w:r>
+      <w:proofErr w:type="spellEnd"/>
+      <w:r>
+        <w:rPr>
+          <w:sz w:val="18"/>
+          <w:szCs w:val="18"/>
+        </w:rPr>
+        <w:t xml:space="preserve"> had none.</w:t>
+      </w:r>
+      <w:r>
+        <w:rPr>
+          <w:sz w:val="18"/>
+          <w:szCs w:val="18"/>
+        </w:rPr>
+        <w:br/>
       </w:r>
     </w:p>
     <w:p>
@@ -2606,7 +2434,7 @@
         <w:spacing w:after="80"/>
       </w:pPr>
       <w:r>
-        <w:t>Resulting shape: 1,470 rows × 31 columns.</w:t>
+        <w:t>Decision: outlier values were identified and quantified per column but left unchanged in the cleaned dataset — no capping, removal, or imputation was applied — so extreme values (e.g., very high salaries or very long tenures) are still reflected in the analysis below.</w:t>
       </w:r>
     </w:p>
     <w:p>
@@ -2618,27 +2446,7 @@
           <w:b/>
           <w:bCs/>
         </w:rPr>
-        <w:t>3.2 Outlier Management (IQR Method)</w:t>
-      </w:r>
-    </w:p>
-    <w:p>
-      <w:pPr>
-        <w:spacing w:after="120"/>
-      </w:pPr>
-      <w:r>
-        <w:t>Continuous numeric columns (columns with more than 10 unique values) were checked for outliers using the 1.5×IQR rule.</w:t>
-      </w:r>
-    </w:p>
-    <w:p>
-      <w:pPr>
-        <w:pStyle w:val="ListParagraph"/>
-        <w:numPr>
-          <w:ilvl w:val="0"/>
-          <w:numId w:val="2"/>
-        </w:numPr>
-      </w:pPr>
-      <w:r>
-        <w:t>Total rows containing at least one outlier value: 240 (about 16.3% of employees).</w:t>
+        <w:t>3.3 Categorical Data Type Optimization</w:t>
       </w:r>
     </w:p>
     <w:p>
@@ -2651,31 +2459,6 @@
         <w:spacing w:after="80"/>
       </w:pPr>
       <w:r>
-        <w:t>Decision: outlier values in the affected continuous columns were replaced with the column median rather than removed, to preserve sample size while limiting the influence of extreme values (e.g., very high salaries or very long tenures).</w:t>
-      </w:r>
-    </w:p>
-    <w:p>
-      <w:pPr>
-        <w:spacing w:before="200" w:after="100"/>
-      </w:pPr>
-      <w:r>
-        <w:rPr>
-          <w:b/>
-          <w:bCs/>
-        </w:rPr>
-        <w:t>3.3 Categorical Data Type Optimization</w:t>
-      </w:r>
-    </w:p>
-    <w:p>
-      <w:pPr>
-        <w:pStyle w:val="ListParagraph"/>
-        <w:numPr>
-          <w:ilvl w:val="0"/>
-          <w:numId w:val="2"/>
-        </w:numPr>
-        <w:spacing w:after="80"/>
-      </w:pPr>
-      <w:r>
         <w:t>All object/string columns (</w:t>
       </w:r>
       <w:r>
@@ -2687,14 +2470,12 @@
       <w:r>
         <w:t xml:space="preserve">, </w:t>
       </w:r>
-      <w:proofErr w:type="spellStart"/>
       <w:r>
         <w:rPr>
           <w:rFonts w:ascii="Consolas" w:hAnsi="Consolas"/>
         </w:rPr>
         <w:t>BusinessTravel</w:t>
       </w:r>
-      <w:proofErr w:type="spellEnd"/>
       <w:r>
         <w:t xml:space="preserve">, </w:t>
       </w:r>
@@ -2707,14 +2488,12 @@
       <w:r>
         <w:t xml:space="preserve">, </w:t>
       </w:r>
-      <w:proofErr w:type="spellStart"/>
       <w:r>
         <w:rPr>
           <w:rFonts w:ascii="Consolas" w:hAnsi="Consolas"/>
         </w:rPr>
         <w:t>EducationField</w:t>
       </w:r>
-      <w:proofErr w:type="spellEnd"/>
       <w:r>
         <w:t xml:space="preserve">, </w:t>
       </w:r>
@@ -2727,61 +2506,39 @@
       <w:r>
         <w:t xml:space="preserve">, </w:t>
       </w:r>
-      <w:proofErr w:type="spellStart"/>
       <w:r>
         <w:rPr>
           <w:rFonts w:ascii="Consolas" w:hAnsi="Consolas"/>
         </w:rPr>
         <w:t>JobRole</w:t>
       </w:r>
-      <w:proofErr w:type="spellEnd"/>
       <w:r>
         <w:t xml:space="preserve">, </w:t>
       </w:r>
-      <w:proofErr w:type="spellStart"/>
       <w:r>
         <w:rPr>
           <w:rFonts w:ascii="Consolas" w:hAnsi="Consolas"/>
         </w:rPr>
         <w:t>MaritalStatus</w:t>
       </w:r>
-      <w:proofErr w:type="spellEnd"/>
       <w:r>
         <w:t xml:space="preserve">, </w:t>
       </w:r>
-      <w:proofErr w:type="spellStart"/>
       <w:r>
         <w:rPr>
           <w:rFonts w:ascii="Consolas" w:hAnsi="Consolas"/>
         </w:rPr>
         <w:t>OverTime</w:t>
       </w:r>
-      <w:proofErr w:type="spellEnd"/>
-      <w:r>
-        <w:t xml:space="preserve">, etc.) were cast to the </w:t>
-      </w:r>
-      <w:proofErr w:type="gramStart"/>
-      <w:r>
-        <w:t>pandas</w:t>
-      </w:r>
-      <w:proofErr w:type="gramEnd"/>
-      <w:r>
-        <w:t xml:space="preserve"> </w:t>
+      <w:r>
+        <w:t xml:space="preserve">, etc.) were cast to the pandas </w:t>
       </w:r>
       <w:r>
         <w:rPr>
           <w:rFonts w:ascii="Consolas" w:hAnsi="Consolas"/>
         </w:rPr>
-        <w:t xml:space="preserve">'category' </w:t>
-      </w:r>
-      <w:proofErr w:type="spellStart"/>
-      <w:r>
-        <w:rPr>
-          <w:rFonts w:ascii="Consolas" w:hAnsi="Consolas"/>
-        </w:rPr>
-        <w:t>dtype</w:t>
-      </w:r>
-      <w:proofErr w:type="spellEnd"/>
+        <w:t>'category' dtype</w:t>
+      </w:r>
       <w:r>
         <w:t xml:space="preserve"> to reduce memory usage and speed up group-by operations.</w:t>
       </w:r>
@@ -2982,13 +2739,8 @@
       <w:pPr>
         <w:spacing w:after="120"/>
       </w:pPr>
-      <w:proofErr w:type="spellStart"/>
-      <w:r>
-        <w:t>Analyze</w:t>
-      </w:r>
-      <w:proofErr w:type="spellEnd"/>
-      <w:r>
-        <w:t xml:space="preserve"> employee attrition across departments, job roles, and overtime status to identify the organizational units and employee groups with the highest turnover risk.</w:t>
+      <w:r>
+        <w:t>Analyze employee attrition across departments, job roles, and overtime status to identify the organizational units and employee groups with the highest turnover risk.</w:t>
       </w:r>
     </w:p>
     <w:p>
@@ -3019,14 +2771,12 @@
       <w:r>
         <w:t xml:space="preserve">, then by </w:t>
       </w:r>
-      <w:proofErr w:type="spellStart"/>
       <w:r>
         <w:rPr>
           <w:rFonts w:ascii="Consolas" w:hAnsi="Consolas"/>
         </w:rPr>
         <w:t>JobRole</w:t>
       </w:r>
-      <w:proofErr w:type="spellEnd"/>
       <w:r>
         <w:t>, and the attrition rate (employees left ÷ total employees × 100) was computed for each group.</w:t>
       </w:r>
@@ -3161,14 +2911,12 @@
       <w:r>
         <w:t xml:space="preserve">Sales, and the Sales Representative role in particular, is the highest-risk area for employee turnover. Employees who work overtime also show a markedly higher attrition rate than those who do not (see the </w:t>
       </w:r>
-      <w:proofErr w:type="spellStart"/>
       <w:r>
         <w:rPr>
           <w:rFonts w:ascii="Consolas" w:hAnsi="Consolas"/>
         </w:rPr>
         <w:t>OverTime</w:t>
       </w:r>
-      <w:proofErr w:type="spellEnd"/>
       <w:r>
         <w:t xml:space="preserve"> analysis below).</w:t>
       </w:r>
@@ -3337,14 +3085,12 @@
       <w:r>
         <w:t xml:space="preserve">A cross-tabulation was performed between </w:t>
       </w:r>
-      <w:proofErr w:type="spellStart"/>
       <w:r>
         <w:rPr>
           <w:rFonts w:ascii="Consolas" w:hAnsi="Consolas"/>
         </w:rPr>
         <w:t>OverTime</w:t>
       </w:r>
-      <w:proofErr w:type="spellEnd"/>
       <w:r>
         <w:t xml:space="preserve"> and </w:t>
       </w:r>
@@ -3613,7 +3359,7 @@
         </w:numPr>
       </w:pPr>
       <w:r>
-        <w:t>Average monthly income rises consistently with Job Level, from about $2,700 at Level 1 to roughly $11,600 at Level 4-5.</w:t>
+        <w:t>Average monthly income rises consistently with Job Level, from about $2,700 at Level 1 to roughly $19,300 at Level 5.</w:t>
       </w:r>
     </w:p>
     <w:p>
@@ -3637,7 +3383,7 @@
         </w:numPr>
       </w:pPr>
       <w:r>
-        <w:t>At Job Levels 3 and 4, employees who left had a higher average income than those who stayed ($9,388 vs. $9,891 at Level 3; $13,150 vs. $10,155 at Level 4).</w:t>
+        <w:t>At Job Level 3, employees who left had a higher average income than those who stayed ($9,388 vs. $9,891); at Level 4, stayers earned more than leavers ($15,620 vs. $13,150).</w:t>
       </w:r>
     </w:p>
     <w:p>
@@ -3650,7 +3396,7 @@
         <w:spacing w:after="80"/>
       </w:pPr>
       <w:r>
-        <w:t>At Job Level 5, average income was essentially identical for both groups (about $4,919).</w:t>
+        <w:t>At Job Level 5, leavers and stayers earned similarly, both around $19,300 ($19,464 vs. $19,171).</w:t>
       </w:r>
     </w:p>
     <w:p>
@@ -3768,7 +3514,7 @@
         <w:spacing w:after="80"/>
       </w:pPr>
       <w:r>
-        <w:t>Investigate income equity further at Job Levels 3 and 4, where leavers earned more than stayers.</w:t>
+        <w:t>Investigate income equity further at Job Level 3, where leavers earned more than stayers despite the overall trend running the other way at most levels.</w:t>
       </w:r>
     </w:p>
     <w:p>
@@ -3849,48 +3595,30 @@
       <w:r>
         <w:t xml:space="preserve">Employees were filtered to </w:t>
       </w:r>
-      <w:proofErr w:type="spellStart"/>
       <w:r>
         <w:rPr>
           <w:rFonts w:ascii="Consolas" w:hAnsi="Consolas"/>
         </w:rPr>
+        <w:t>JobSatisfaction ≤ 2</w:t>
+      </w:r>
+      <w:r>
+        <w:t xml:space="preserve"> and </w:t>
+      </w:r>
+      <w:r>
+        <w:rPr>
+          <w:rFonts w:ascii="Consolas" w:hAnsi="Consolas"/>
+        </w:rPr>
+        <w:t>OverTime = Yes</w:t>
+      </w:r>
+      <w:r>
+        <w:t xml:space="preserve">, then grouped by </w:t>
+      </w:r>
+      <w:r>
+        <w:rPr>
+          <w:rFonts w:ascii="Consolas" w:hAnsi="Consolas"/>
+        </w:rPr>
         <w:t>JobSatisfaction</w:t>
       </w:r>
-      <w:proofErr w:type="spellEnd"/>
-      <w:r>
-        <w:rPr>
-          <w:rFonts w:ascii="Consolas" w:hAnsi="Consolas"/>
-        </w:rPr>
-        <w:t xml:space="preserve"> ≤ 2</w:t>
-      </w:r>
-      <w:r>
-        <w:t xml:space="preserve"> and </w:t>
-      </w:r>
-      <w:proofErr w:type="spellStart"/>
-      <w:r>
-        <w:rPr>
-          <w:rFonts w:ascii="Consolas" w:hAnsi="Consolas"/>
-        </w:rPr>
-        <w:t>OverTime</w:t>
-      </w:r>
-      <w:proofErr w:type="spellEnd"/>
-      <w:r>
-        <w:rPr>
-          <w:rFonts w:ascii="Consolas" w:hAnsi="Consolas"/>
-        </w:rPr>
-        <w:t xml:space="preserve"> = Yes</w:t>
-      </w:r>
-      <w:r>
-        <w:t xml:space="preserve">, then grouped by </w:t>
-      </w:r>
-      <w:proofErr w:type="spellStart"/>
-      <w:r>
-        <w:rPr>
-          <w:rFonts w:ascii="Consolas" w:hAnsi="Consolas"/>
-        </w:rPr>
-        <w:t>JobSatisfaction</w:t>
-      </w:r>
-      <w:proofErr w:type="spellEnd"/>
       <w:r>
         <w:t xml:space="preserve"> level to compute the attrition rate within each group.</w:t>
       </w:r>
@@ -4332,7 +4060,6 @@
         <w:lastRenderedPageBreak/>
         <w:t>Question: How does employee attrition vary across tenure groups (</w:t>
       </w:r>
-      <w:proofErr w:type="spellStart"/>
       <w:r>
         <w:rPr>
           <w:rFonts w:ascii="Consolas" w:hAnsi="Consolas"/>
@@ -4344,7 +4071,6 @@
         </w:rPr>
         <w:t>YearsAtCompany</w:t>
       </w:r>
-      <w:proofErr w:type="spellEnd"/>
       <w:r>
         <w:rPr>
           <w:b/>
@@ -4395,14 +4121,12 @@
       <w:r>
         <w:t xml:space="preserve">Employees were grouped into five tenure bands based on </w:t>
       </w:r>
-      <w:proofErr w:type="spellStart"/>
       <w:r>
         <w:rPr>
           <w:rFonts w:ascii="Consolas" w:hAnsi="Consolas"/>
         </w:rPr>
         <w:t>YearsAtCompany</w:t>
       </w:r>
-      <w:proofErr w:type="spellEnd"/>
       <w:r>
         <w:t>: 0-2, 3-5, 6-10, 11-15, and 16+ years, and the attrition rate was computed for each band.</w:t>
       </w:r>
@@ -4440,7 +4164,7 @@
         </w:numPr>
       </w:pPr>
       <w:r>
-        <w:t>3-5 Years: 13.01% attrition.</w:t>
+        <w:t>3-5 Years: 13.82% attrition.</w:t>
       </w:r>
     </w:p>
     <w:p>
@@ -4477,7 +4201,7 @@
         <w:spacing w:after="80"/>
       </w:pPr>
       <w:r>
-        <w:t>16+ Years: 8.82% attrition.</w:t>
+        <w:t>16+ Years: 9.42% attrition.</w:t>
       </w:r>
     </w:p>
     <w:p>
@@ -4546,15 +4270,7 @@
         <w:spacing w:after="120"/>
       </w:pPr>
       <w:r>
-        <w:t xml:space="preserve">Attrition risk is highest in an employee's first two years and drops sharply through the </w:t>
-      </w:r>
-      <w:proofErr w:type="gramStart"/>
-      <w:r>
-        <w:t>11-15 year</w:t>
-      </w:r>
-      <w:proofErr w:type="gramEnd"/>
-      <w:r>
-        <w:t xml:space="preserve"> mark, before ticking up slightly again for the longest-tenured employees. The early tenure period is clearly the point of greatest flight risk.</w:t>
+        <w:t>Attrition risk is highest in an employee's first two years and drops sharply through the 11-15 year mark, before ticking up slightly again for the longest-tenured employees. The early tenure period is clearly the point of greatest flight risk.</w:t>
       </w:r>
     </w:p>
     <w:p>
@@ -4695,36 +4411,30 @@
       <w:r>
         <w:t xml:space="preserve">Employees were grouped by Attrition Status (Left/Stayed), and the mean of </w:t>
       </w:r>
-      <w:proofErr w:type="spellStart"/>
       <w:r>
         <w:rPr>
           <w:rFonts w:ascii="Consolas" w:hAnsi="Consolas"/>
         </w:rPr>
         <w:t>MonthlyIncome</w:t>
       </w:r>
-      <w:proofErr w:type="spellEnd"/>
       <w:r>
         <w:t xml:space="preserve">, </w:t>
       </w:r>
-      <w:proofErr w:type="spellStart"/>
       <w:r>
         <w:rPr>
           <w:rFonts w:ascii="Consolas" w:hAnsi="Consolas"/>
         </w:rPr>
         <w:t>JobSatisfaction</w:t>
       </w:r>
-      <w:proofErr w:type="spellEnd"/>
       <w:r>
         <w:t xml:space="preserve">, and </w:t>
       </w:r>
-      <w:proofErr w:type="spellStart"/>
       <w:r>
         <w:rPr>
           <w:rFonts w:ascii="Consolas" w:hAnsi="Consolas"/>
         </w:rPr>
         <w:t>WorkLifeBalance</w:t>
       </w:r>
-      <w:proofErr w:type="spellEnd"/>
       <w:r>
         <w:t xml:space="preserve"> was computed for each group.</w:t>
       </w:r>
@@ -4750,7 +4460,7 @@
         </w:numPr>
       </w:pPr>
       <w:r>
-        <w:t>Average Monthly Income — Left: $4,480 vs. Stayed: $5,645 (a gap of roughly 20%).</w:t>
+        <w:t>Average Monthly Income — Left: $4,787 vs. Stayed: $6,833 (a gap of roughly 30%).</w:t>
       </w:r>
     </w:p>
     <w:p>
@@ -4986,15 +4696,7 @@
         <w:spacing w:after="80"/>
       </w:pPr>
       <w:r>
-        <w:t xml:space="preserve">Early-career turnover hazard: 29.82% attrition in the </w:t>
-      </w:r>
-      <w:proofErr w:type="gramStart"/>
-      <w:r>
-        <w:t>0-2 year</w:t>
-      </w:r>
-      <w:proofErr w:type="gramEnd"/>
-      <w:r>
-        <w:t xml:space="preserve"> tenure band</w:t>
+        <w:t>Early-career turnover hazard: 29.82% attrition in the 0-2 year tenure band</w:t>
       </w:r>
     </w:p>
     <w:p>

</xml_diff>